<commit_message>
entregables: actualiza portada con datos del equipo, sección y docente
Portada con sección 004V, docente Johnnathan René Cubillos Flores e integrantes Elías Delgado y Rolando Aldana. Word y PDF regenerados con la redacción revisada de docs/.
</commit_message>
<xml_diff>
--- a/entregables/EP1_ISY1102_Informe_Plan_de_Pruebas_Atlas.docx
+++ b/entregables/EP1_ISY1102_Informe_Plan_de_Pruebas_Atlas.docx
@@ -108,6 +108,24 @@
     <w:p>
       <w:pPr>
         <w:pStyle w:val="Normal"/>
+        <w:spacing w:before="0" w:after="120"/>
+        <w:jc w:val="center"/>
+        <w:rPr/>
+      </w:pPr>
+      <w:r>
+        <w:rPr>
+          <w:rFonts w:eastAsia="Arial" w:cs="Arial"/>
+          <w:b w:val="false"/>
+          <w:bCs w:val="false"/>
+          <w:sz w:val="22"/>
+          <w:szCs w:val="22"/>
+        </w:rPr>
+        <w:t>Sección 004V</w:t>
+      </w:r>
+    </w:p>
+    <w:p>
+      <w:pPr>
+        <w:pStyle w:val="Normal"/>
         <w:spacing w:before="0" w:after="600"/>
         <w:jc w:val="center"/>
         <w:rPr/>
@@ -120,7 +138,7 @@
           <w:sz w:val="22"/>
           <w:szCs w:val="22"/>
         </w:rPr>
-        <w:t>Sección [XXXX]</w:t>
+        <w:t>Duoc UC – Escuela de Informática y Telecomunicaciones</w:t>
       </w:r>
     </w:p>
     <w:p>
@@ -174,7 +192,7 @@
           <w:sz w:val="22"/>
           <w:szCs w:val="22"/>
         </w:rPr>
-        <w:t>[Nombre Apellido integrante 2]</w:t>
+        <w:t>Rolando Aldana</w:t>
       </w:r>
     </w:p>
     <w:p>
@@ -210,7 +228,7 @@
           <w:sz w:val="22"/>
           <w:szCs w:val="22"/>
         </w:rPr>
-        <w:t>Docente: [Nombre docente]</w:t>
+        <w:t>Docente: Johnnathan René Cubillos Flores</w:t>
       </w:r>
     </w:p>
     <w:p>
@@ -228,7 +246,7 @@
           <w:sz w:val="22"/>
           <w:szCs w:val="22"/>
         </w:rPr>
-        <w:t>Fecha: 16 de septiembre de 2026</w:t>
+        <w:t>Fecha: 15 de septiembre de 2026</w:t>
       </w:r>
     </w:p>
     <w:p>
@@ -293,7 +311,7 @@
             </w:rPr>
             <w:fldChar w:fldCharType="separate"/>
           </w:r>
-          <w:hyperlink w:anchor="__RefHeading___Toc3426_2538103707">
+          <w:hyperlink w:anchor="__RefHeading___Toc3432_158910726">
             <w:r>
               <w:rPr>
                 <w:rStyle w:val="IndexLink"/>
@@ -313,7 +331,7 @@
             </w:tabs>
             <w:rPr/>
           </w:pPr>
-          <w:hyperlink w:anchor="__RefHeading___Toc3428_2538103707">
+          <w:hyperlink w:anchor="__RefHeading___Toc3434_158910726">
             <w:r>
               <w:rPr>
                 <w:rStyle w:val="IndexLink"/>
@@ -333,7 +351,7 @@
             </w:tabs>
             <w:rPr/>
           </w:pPr>
-          <w:hyperlink w:anchor="__RefHeading___Toc3430_2538103707">
+          <w:hyperlink w:anchor="__RefHeading___Toc3436_158910726">
             <w:r>
               <w:rPr>
                 <w:rStyle w:val="IndexLink"/>
@@ -353,7 +371,7 @@
             </w:tabs>
             <w:rPr/>
           </w:pPr>
-          <w:hyperlink w:anchor="__RefHeading___Toc3432_2538103707">
+          <w:hyperlink w:anchor="__RefHeading___Toc3438_158910726">
             <w:r>
               <w:rPr>
                 <w:rStyle w:val="IndexLink"/>
@@ -373,7 +391,7 @@
             </w:tabs>
             <w:rPr/>
           </w:pPr>
-          <w:hyperlink w:anchor="__RefHeading___Toc3434_2538103707">
+          <w:hyperlink w:anchor="__RefHeading___Toc3440_158910726">
             <w:r>
               <w:rPr>
                 <w:rStyle w:val="IndexLink"/>
@@ -393,7 +411,7 @@
             </w:tabs>
             <w:rPr/>
           </w:pPr>
-          <w:hyperlink w:anchor="__RefHeading___Toc3436_2538103707">
+          <w:hyperlink w:anchor="__RefHeading___Toc3442_158910726">
             <w:r>
               <w:rPr>
                 <w:rStyle w:val="IndexLink"/>
@@ -413,7 +431,7 @@
             </w:tabs>
             <w:rPr/>
           </w:pPr>
-          <w:hyperlink w:anchor="__RefHeading___Toc3438_2538103707">
+          <w:hyperlink w:anchor="__RefHeading___Toc3444_158910726">
             <w:r>
               <w:rPr>
                 <w:rStyle w:val="IndexLink"/>
@@ -433,7 +451,7 @@
             </w:tabs>
             <w:rPr/>
           </w:pPr>
-          <w:hyperlink w:anchor="__RefHeading___Toc3440_2538103707">
+          <w:hyperlink w:anchor="__RefHeading___Toc3446_158910726">
             <w:r>
               <w:rPr>
                 <w:rStyle w:val="IndexLink"/>
@@ -453,7 +471,7 @@
             </w:tabs>
             <w:rPr/>
           </w:pPr>
-          <w:hyperlink w:anchor="__RefHeading___Toc3442_2538103707">
+          <w:hyperlink w:anchor="__RefHeading___Toc3448_158910726">
             <w:r>
               <w:rPr>
                 <w:rStyle w:val="IndexLink"/>
@@ -473,7 +491,7 @@
             </w:tabs>
             <w:rPr/>
           </w:pPr>
-          <w:hyperlink w:anchor="__RefHeading___Toc3444_2538103707">
+          <w:hyperlink w:anchor="__RefHeading___Toc3450_158910726">
             <w:r>
               <w:rPr>
                 <w:rStyle w:val="IndexLink"/>
@@ -493,7 +511,7 @@
             </w:tabs>
             <w:rPr/>
           </w:pPr>
-          <w:hyperlink w:anchor="__RefHeading___Toc3446_2538103707">
+          <w:hyperlink w:anchor="__RefHeading___Toc3452_158910726">
             <w:r>
               <w:rPr>
                 <w:rStyle w:val="IndexLink"/>
@@ -513,7 +531,7 @@
             </w:tabs>
             <w:rPr/>
           </w:pPr>
-          <w:hyperlink w:anchor="__RefHeading___Toc3448_2538103707">
+          <w:hyperlink w:anchor="__RefHeading___Toc3454_158910726">
             <w:r>
               <w:rPr>
                 <w:rStyle w:val="IndexLink"/>
@@ -533,7 +551,7 @@
             </w:tabs>
             <w:rPr/>
           </w:pPr>
-          <w:hyperlink w:anchor="__RefHeading___Toc3450_2538103707">
+          <w:hyperlink w:anchor="__RefHeading___Toc3456_158910726">
             <w:r>
               <w:rPr>
                 <w:rStyle w:val="IndexLink"/>
@@ -553,7 +571,7 @@
             </w:tabs>
             <w:rPr/>
           </w:pPr>
-          <w:hyperlink w:anchor="__RefHeading___Toc3452_2538103707">
+          <w:hyperlink w:anchor="__RefHeading___Toc3458_158910726">
             <w:r>
               <w:rPr>
                 <w:rStyle w:val="IndexLink"/>
@@ -573,7 +591,7 @@
             </w:tabs>
             <w:rPr/>
           </w:pPr>
-          <w:hyperlink w:anchor="__RefHeading___Toc3454_2538103707">
+          <w:hyperlink w:anchor="__RefHeading___Toc3460_158910726">
             <w:r>
               <w:rPr>
                 <w:rStyle w:val="IndexLink"/>
@@ -593,7 +611,7 @@
             </w:tabs>
             <w:rPr/>
           </w:pPr>
-          <w:hyperlink w:anchor="__RefHeading___Toc3456_2538103707">
+          <w:hyperlink w:anchor="__RefHeading___Toc3462_158910726">
             <w:r>
               <w:rPr>
                 <w:rStyle w:val="IndexLink"/>
@@ -613,7 +631,7 @@
             </w:tabs>
             <w:rPr/>
           </w:pPr>
-          <w:hyperlink w:anchor="__RefHeading___Toc3458_2538103707">
+          <w:hyperlink w:anchor="__RefHeading___Toc3464_158910726">
             <w:r>
               <w:rPr>
                 <w:rStyle w:val="IndexLink"/>
@@ -633,7 +651,7 @@
             </w:tabs>
             <w:rPr/>
           </w:pPr>
-          <w:hyperlink w:anchor="__RefHeading___Toc3460_2538103707">
+          <w:hyperlink w:anchor="__RefHeading___Toc3466_158910726">
             <w:r>
               <w:rPr>
                 <w:rStyle w:val="IndexLink"/>
@@ -653,7 +671,7 @@
             </w:tabs>
             <w:rPr/>
           </w:pPr>
-          <w:hyperlink w:anchor="__RefHeading___Toc3462_2538103707">
+          <w:hyperlink w:anchor="__RefHeading___Toc3468_158910726">
             <w:r>
               <w:rPr>
                 <w:rStyle w:val="IndexLink"/>
@@ -673,7 +691,7 @@
             </w:tabs>
             <w:rPr/>
           </w:pPr>
-          <w:hyperlink w:anchor="__RefHeading___Toc3464_2538103707">
+          <w:hyperlink w:anchor="__RefHeading___Toc3470_158910726">
             <w:r>
               <w:rPr>
                 <w:rStyle w:val="IndexLink"/>
@@ -693,7 +711,7 @@
             </w:tabs>
             <w:rPr/>
           </w:pPr>
-          <w:hyperlink w:anchor="__RefHeading___Toc3466_2538103707">
+          <w:hyperlink w:anchor="__RefHeading___Toc3472_158910726">
             <w:r>
               <w:rPr>
                 <w:rStyle w:val="IndexLink"/>
@@ -713,7 +731,7 @@
             </w:tabs>
             <w:rPr/>
           </w:pPr>
-          <w:hyperlink w:anchor="__RefHeading___Toc3468_2538103707">
+          <w:hyperlink w:anchor="__RefHeading___Toc3474_158910726">
             <w:r>
               <w:rPr>
                 <w:rStyle w:val="IndexLink"/>
@@ -733,7 +751,7 @@
             </w:tabs>
             <w:rPr/>
           </w:pPr>
-          <w:hyperlink w:anchor="__RefHeading___Toc3470_2538103707">
+          <w:hyperlink w:anchor="__RefHeading___Toc3476_158910726">
             <w:r>
               <w:rPr>
                 <w:rStyle w:val="IndexLink"/>
@@ -753,7 +771,7 @@
             </w:tabs>
             <w:rPr/>
           </w:pPr>
-          <w:hyperlink w:anchor="__RefHeading___Toc3472_2538103707">
+          <w:hyperlink w:anchor="__RefHeading___Toc3478_158910726">
             <w:r>
               <w:rPr>
                 <w:rStyle w:val="IndexLink"/>
@@ -773,7 +791,7 @@
             </w:tabs>
             <w:rPr/>
           </w:pPr>
-          <w:hyperlink w:anchor="__RefHeading___Toc3474_2538103707">
+          <w:hyperlink w:anchor="__RefHeading___Toc3480_158910726">
             <w:r>
               <w:rPr>
                 <w:rStyle w:val="IndexLink"/>
@@ -793,7 +811,7 @@
             </w:tabs>
             <w:rPr/>
           </w:pPr>
-          <w:hyperlink w:anchor="__RefHeading___Toc3476_2538103707">
+          <w:hyperlink w:anchor="__RefHeading___Toc3482_158910726">
             <w:r>
               <w:rPr>
                 <w:rStyle w:val="IndexLink"/>
@@ -813,7 +831,7 @@
             </w:tabs>
             <w:rPr/>
           </w:pPr>
-          <w:hyperlink w:anchor="__RefHeading___Toc3478_2538103707">
+          <w:hyperlink w:anchor="__RefHeading___Toc3484_158910726">
             <w:r>
               <w:rPr>
                 <w:rStyle w:val="IndexLink"/>
@@ -833,7 +851,7 @@
             </w:tabs>
             <w:rPr/>
           </w:pPr>
-          <w:hyperlink w:anchor="__RefHeading___Toc3480_2538103707">
+          <w:hyperlink w:anchor="__RefHeading___Toc3486_158910726">
             <w:r>
               <w:rPr>
                 <w:rStyle w:val="IndexLink"/>
@@ -853,7 +871,7 @@
             </w:tabs>
             <w:rPr/>
           </w:pPr>
-          <w:hyperlink w:anchor="__RefHeading___Toc3482_2538103707">
+          <w:hyperlink w:anchor="__RefHeading___Toc3488_158910726">
             <w:r>
               <w:rPr>
                 <w:rStyle w:val="IndexLink"/>
@@ -873,7 +891,7 @@
             </w:tabs>
             <w:rPr/>
           </w:pPr>
-          <w:hyperlink w:anchor="__RefHeading___Toc3484_2538103707">
+          <w:hyperlink w:anchor="__RefHeading___Toc3490_158910726">
             <w:r>
               <w:rPr>
                 <w:rStyle w:val="IndexLink"/>
@@ -893,7 +911,7 @@
             </w:tabs>
             <w:rPr/>
           </w:pPr>
-          <w:hyperlink w:anchor="__RefHeading___Toc3486_2538103707">
+          <w:hyperlink w:anchor="__RefHeading___Toc3492_158910726">
             <w:r>
               <w:rPr>
                 <w:rStyle w:val="IndexLink"/>
@@ -913,7 +931,7 @@
             </w:tabs>
             <w:rPr/>
           </w:pPr>
-          <w:hyperlink w:anchor="__RefHeading___Toc3488_2538103707">
+          <w:hyperlink w:anchor="__RefHeading___Toc3494_158910726">
             <w:r>
               <w:rPr>
                 <w:rStyle w:val="IndexLink"/>
@@ -933,7 +951,7 @@
             </w:tabs>
             <w:rPr/>
           </w:pPr>
-          <w:hyperlink w:anchor="__RefHeading___Toc3490_2538103707">
+          <w:hyperlink w:anchor="__RefHeading___Toc3496_158910726">
             <w:r>
               <w:rPr>
                 <w:rStyle w:val="IndexLink"/>
@@ -953,7 +971,7 @@
             </w:tabs>
             <w:rPr/>
           </w:pPr>
-          <w:hyperlink w:anchor="__RefHeading___Toc3492_2538103707">
+          <w:hyperlink w:anchor="__RefHeading___Toc3498_158910726">
             <w:r>
               <w:rPr>
                 <w:rStyle w:val="IndexLink"/>
@@ -973,7 +991,7 @@
             </w:tabs>
             <w:rPr/>
           </w:pPr>
-          <w:hyperlink w:anchor="__RefHeading___Toc3494_2538103707">
+          <w:hyperlink w:anchor="__RefHeading___Toc3500_158910726">
             <w:r>
               <w:rPr>
                 <w:rStyle w:val="IndexLink"/>
@@ -993,7 +1011,7 @@
             </w:tabs>
             <w:rPr/>
           </w:pPr>
-          <w:hyperlink w:anchor="__RefHeading___Toc3496_2538103707">
+          <w:hyperlink w:anchor="__RefHeading___Toc3502_158910726">
             <w:r>
               <w:rPr>
                 <w:rStyle w:val="IndexLink"/>
@@ -1013,7 +1031,7 @@
             </w:tabs>
             <w:rPr/>
           </w:pPr>
-          <w:hyperlink w:anchor="__RefHeading___Toc3498_2538103707">
+          <w:hyperlink w:anchor="__RefHeading___Toc3504_158910726">
             <w:r>
               <w:rPr>
                 <w:rStyle w:val="IndexLink"/>
@@ -1033,7 +1051,7 @@
             </w:tabs>
             <w:rPr/>
           </w:pPr>
-          <w:hyperlink w:anchor="__RefHeading___Toc3500_2538103707">
+          <w:hyperlink w:anchor="__RefHeading___Toc3506_158910726">
             <w:r>
               <w:rPr>
                 <w:rStyle w:val="IndexLink"/>
@@ -1053,7 +1071,7 @@
             </w:tabs>
             <w:rPr/>
           </w:pPr>
-          <w:hyperlink w:anchor="__RefHeading___Toc3502_2538103707">
+          <w:hyperlink w:anchor="__RefHeading___Toc3508_158910726">
             <w:r>
               <w:rPr>
                 <w:rStyle w:val="IndexLink"/>
@@ -1073,7 +1091,7 @@
             </w:tabs>
             <w:rPr/>
           </w:pPr>
-          <w:hyperlink w:anchor="__RefHeading___Toc3504_2538103707">
+          <w:hyperlink w:anchor="__RefHeading___Toc3510_158910726">
             <w:r>
               <w:rPr>
                 <w:rStyle w:val="IndexLink"/>
@@ -1093,7 +1111,7 @@
             </w:tabs>
             <w:rPr/>
           </w:pPr>
-          <w:hyperlink w:anchor="__RefHeading___Toc3506_2538103707">
+          <w:hyperlink w:anchor="__RefHeading___Toc3512_158910726">
             <w:r>
               <w:rPr>
                 <w:rStyle w:val="IndexLink"/>
@@ -1113,7 +1131,7 @@
             </w:tabs>
             <w:rPr/>
           </w:pPr>
-          <w:hyperlink w:anchor="__RefHeading___Toc3508_2538103707">
+          <w:hyperlink w:anchor="__RefHeading___Toc3514_158910726">
             <w:r>
               <w:rPr>
                 <w:rStyle w:val="IndexLink"/>
@@ -1133,7 +1151,7 @@
             </w:tabs>
             <w:rPr/>
           </w:pPr>
-          <w:hyperlink w:anchor="__RefHeading___Toc3510_2538103707">
+          <w:hyperlink w:anchor="__RefHeading___Toc3516_158910726">
             <w:r>
               <w:rPr>
                 <w:rStyle w:val="IndexLink"/>
@@ -1153,7 +1171,7 @@
             </w:tabs>
             <w:rPr/>
           </w:pPr>
-          <w:hyperlink w:anchor="__RefHeading___Toc3512_2538103707">
+          <w:hyperlink w:anchor="__RefHeading___Toc3518_158910726">
             <w:r>
               <w:rPr>
                 <w:rStyle w:val="IndexLink"/>
@@ -1173,7 +1191,7 @@
             </w:tabs>
             <w:rPr/>
           </w:pPr>
-          <w:hyperlink w:anchor="__RefHeading___Toc3514_2538103707">
+          <w:hyperlink w:anchor="__RefHeading___Toc3520_158910726">
             <w:r>
               <w:rPr>
                 <w:rStyle w:val="IndexLink"/>
@@ -1193,7 +1211,7 @@
             </w:tabs>
             <w:rPr/>
           </w:pPr>
-          <w:hyperlink w:anchor="__RefHeading___Toc3516_2538103707">
+          <w:hyperlink w:anchor="__RefHeading___Toc3522_158910726">
             <w:r>
               <w:rPr>
                 <w:rStyle w:val="IndexLink"/>
@@ -1213,7 +1231,7 @@
             </w:tabs>
             <w:rPr/>
           </w:pPr>
-          <w:hyperlink w:anchor="__RefHeading___Toc3518_2538103707">
+          <w:hyperlink w:anchor="__RefHeading___Toc3524_158910726">
             <w:r>
               <w:rPr>
                 <w:rStyle w:val="IndexLink"/>
@@ -1233,7 +1251,7 @@
             </w:tabs>
             <w:rPr/>
           </w:pPr>
-          <w:hyperlink w:anchor="__RefHeading___Toc3520_2538103707">
+          <w:hyperlink w:anchor="__RefHeading___Toc3526_158910726">
             <w:r>
               <w:rPr>
                 <w:rStyle w:val="IndexLink"/>
@@ -1253,7 +1271,7 @@
             </w:tabs>
             <w:rPr/>
           </w:pPr>
-          <w:hyperlink w:anchor="__RefHeading___Toc3522_2538103707">
+          <w:hyperlink w:anchor="__RefHeading___Toc3528_158910726">
             <w:r>
               <w:rPr>
                 <w:rStyle w:val="IndexLink"/>
@@ -1273,7 +1291,7 @@
             </w:tabs>
             <w:rPr/>
           </w:pPr>
-          <w:hyperlink w:anchor="__RefHeading___Toc3524_2538103707">
+          <w:hyperlink w:anchor="__RefHeading___Toc3530_158910726">
             <w:r>
               <w:rPr>
                 <w:rStyle w:val="IndexLink"/>
@@ -1293,7 +1311,7 @@
             </w:tabs>
             <w:rPr/>
           </w:pPr>
-          <w:hyperlink w:anchor="__RefHeading___Toc3526_2538103707">
+          <w:hyperlink w:anchor="__RefHeading___Toc3532_158910726">
             <w:r>
               <w:rPr>
                 <w:rStyle w:val="IndexLink"/>
@@ -1313,7 +1331,7 @@
             </w:tabs>
             <w:rPr/>
           </w:pPr>
-          <w:hyperlink w:anchor="__RefHeading___Toc3528_2538103707">
+          <w:hyperlink w:anchor="__RefHeading___Toc3534_158910726">
             <w:r>
               <w:rPr>
                 <w:rStyle w:val="IndexLink"/>
@@ -1333,7 +1351,7 @@
             </w:tabs>
             <w:rPr/>
           </w:pPr>
-          <w:hyperlink w:anchor="__RefHeading___Toc3530_2538103707">
+          <w:hyperlink w:anchor="__RefHeading___Toc3536_158910726">
             <w:r>
               <w:rPr>
                 <w:rStyle w:val="IndexLink"/>
@@ -1353,7 +1371,7 @@
             </w:tabs>
             <w:rPr/>
           </w:pPr>
-          <w:hyperlink w:anchor="__RefHeading___Toc3532_2538103707">
+          <w:hyperlink w:anchor="__RefHeading___Toc3538_158910726">
             <w:r>
               <w:rPr>
                 <w:rStyle w:val="IndexLink"/>
@@ -1373,7 +1391,7 @@
             </w:tabs>
             <w:rPr/>
           </w:pPr>
-          <w:hyperlink w:anchor="__RefHeading___Toc3534_2538103707">
+          <w:hyperlink w:anchor="__RefHeading___Toc3540_158910726">
             <w:r>
               <w:rPr>
                 <w:rStyle w:val="IndexLink"/>
@@ -1393,7 +1411,7 @@
             </w:tabs>
             <w:rPr/>
           </w:pPr>
-          <w:hyperlink w:anchor="__RefHeading___Toc3536_2538103707">
+          <w:hyperlink w:anchor="__RefHeading___Toc3542_158910726">
             <w:r>
               <w:rPr>
                 <w:rStyle w:val="IndexLink"/>
@@ -1413,7 +1431,7 @@
             </w:tabs>
             <w:rPr/>
           </w:pPr>
-          <w:hyperlink w:anchor="__RefHeading___Toc3538_2538103707">
+          <w:hyperlink w:anchor="__RefHeading___Toc3544_158910726">
             <w:r>
               <w:rPr>
                 <w:rStyle w:val="IndexLink"/>
@@ -1433,7 +1451,7 @@
             </w:tabs>
             <w:rPr/>
           </w:pPr>
-          <w:hyperlink w:anchor="__RefHeading___Toc3540_2538103707">
+          <w:hyperlink w:anchor="__RefHeading___Toc3546_158910726">
             <w:r>
               <w:rPr>
                 <w:rStyle w:val="IndexLink"/>
@@ -1453,7 +1471,7 @@
             </w:tabs>
             <w:rPr/>
           </w:pPr>
-          <w:hyperlink w:anchor="__RefHeading___Toc3542_2538103707">
+          <w:hyperlink w:anchor="__RefHeading___Toc3548_158910726">
             <w:r>
               <w:rPr>
                 <w:rStyle w:val="IndexLink"/>
@@ -1499,7 +1517,7 @@
         <w:spacing w:before="0" w:after="180"/>
         <w:rPr/>
       </w:pPr>
-      <w:bookmarkStart w:id="0" w:name="__RefHeading___Toc3426_2538103707"/>
+      <w:bookmarkStart w:id="0" w:name="__RefHeading___Toc3432_158910726"/>
       <w:bookmarkEnd w:id="0"/>
       <w:r>
         <w:rPr>
@@ -1513,7 +1531,7 @@
         <w:pStyle w:val="Heading2"/>
         <w:rPr/>
       </w:pPr>
-      <w:bookmarkStart w:id="1" w:name="__RefHeading___Toc3428_2538103707"/>
+      <w:bookmarkStart w:id="1" w:name="__RefHeading___Toc3434_158910726"/>
       <w:bookmarkEnd w:id="1"/>
       <w:r>
         <w:rPr>
@@ -1559,7 +1577,7 @@
         <w:pStyle w:val="Heading2"/>
         <w:rPr/>
       </w:pPr>
-      <w:bookmarkStart w:id="2" w:name="__RefHeading___Toc3430_2538103707"/>
+      <w:bookmarkStart w:id="2" w:name="__RefHeading___Toc3436_158910726"/>
       <w:bookmarkEnd w:id="2"/>
       <w:r>
         <w:rPr>
@@ -1581,7 +1599,7 @@
           <w:sz w:val="22"/>
           <w:szCs w:val="22"/>
         </w:rPr>
-        <w:t>Para orientar el plan se clasificó Atlas según los tres ejes de la asignatura:</w:t>
+        <w:t>Antes de definir las pruebas clasificamos Atlas según los tres ejes vistos en la asignatura:</w:t>
       </w:r>
     </w:p>
     <w:tbl>
@@ -1971,7 +1989,7 @@
           <w:sz w:val="22"/>
           <w:szCs w:val="22"/>
         </w:rPr>
-        <w:t>Esta clasificación explica por qué el foco del plan no está solo en que las funciones "operen", sino en que lo hagan resguardando la confidencialidad entre empresas, la integridad de los contratos y la trazabilidad exigida por la normativa de protección de datos.</w:t>
+        <w:t>Por esta clasificación, el plan no se limita a comprobar que las funciones operen. También verifica que se respete la confidencialidad entre empresas, la integridad de los contratos y la trazabilidad que exige la normativa de protección de datos.</w:t>
       </w:r>
     </w:p>
     <w:p>
@@ -1979,7 +1997,7 @@
         <w:pStyle w:val="Heading2"/>
         <w:rPr/>
       </w:pPr>
-      <w:bookmarkStart w:id="3" w:name="__RefHeading___Toc3432_2538103707"/>
+      <w:bookmarkStart w:id="3" w:name="__RefHeading___Toc3438_158910726"/>
       <w:bookmarkEnd w:id="3"/>
       <w:r>
         <w:rPr>
@@ -2001,7 +2019,7 @@
           <w:sz w:val="22"/>
           <w:szCs w:val="22"/>
         </w:rPr>
-        <w:t>El propósito de este plan es definir de manera sistemática cómo se verificará que Atlas cumple con sus requerimientos funcionales, no funcionales y reglas de negocio, y cómo esa verificación se relaciona con los estándares de calidad y el marco legal aplicable. En concreto, se busca asegurar que:</w:t>
+        <w:t>Este plan define cómo vamos a verificar que Atlas cumple sus requerimientos funcionales, no funcionales y reglas de negocio, y cómo cada verificación se relaciona con los estándares de calidad y el marco legal. Buscamos asegurar que:</w:t>
       </w:r>
     </w:p>
     <w:p>
@@ -2109,7 +2127,7 @@
         <w:pStyle w:val="Heading2"/>
         <w:rPr/>
       </w:pPr>
-      <w:bookmarkStart w:id="4" w:name="__RefHeading___Toc3434_2538103707"/>
+      <w:bookmarkStart w:id="4" w:name="__RefHeading___Toc3440_158910726"/>
       <w:bookmarkEnd w:id="4"/>
       <w:r>
         <w:rPr>
@@ -2167,7 +2185,7 @@
           <w:sz w:val="22"/>
           <w:szCs w:val="22"/>
         </w:rPr>
-        <w:t xml:space="preserve"> pruebas sobre la infraestructura física del proveedor de hosting, el servicio de correo externo más allá de su integración, y auditorías legales formales, que corresponden a un asesor jurídico. Estos puntos se registran como riesgos y dependencias.</w:t>
+        <w:t xml:space="preserve"> pruebas sobre la infraestructura física del proveedor de hosting, el servicio de correo externo más allá de su integración, y auditorías legales formales, que corresponden a un asesor jurídico. Estos puntos quedan registrados como riesgos y dependencias.</w:t>
       </w:r>
     </w:p>
     <w:p>
@@ -2175,7 +2193,7 @@
         <w:pStyle w:val="Heading2"/>
         <w:rPr/>
       </w:pPr>
-      <w:bookmarkStart w:id="5" w:name="__RefHeading___Toc3436_2538103707"/>
+      <w:bookmarkStart w:id="5" w:name="__RefHeading___Toc3442_158910726"/>
       <w:bookmarkEnd w:id="5"/>
       <w:r>
         <w:rPr>
@@ -2197,7 +2215,7 @@
           <w:sz w:val="22"/>
           <w:szCs w:val="22"/>
         </w:rPr>
-        <w:t>El documento se organiza en: criterios de calidad, seguridad y cumplimiento normativo (sección 2); tipos de prueba y su justificación (sección 3); estrategia de pruebas (sección 4); criterios de aceptación y herramientas (secciones 5 y 6); recursos y cronograma (secciones 7 y 8); diseño de casos de prueba (sección 9); matriz de trazabilidad entre requerimientos, pruebas y controles normativos (sección 10); y análisis de cobertura y coherencia del plan (sección 11).</w:t>
+        <w:t>El informe se organiza así: criterios de calidad, seguridad y cumplimiento normativo (sección 2); tipos de prueba y su justificación (sección 3); estrategia de pruebas (sección 4); criterios de aceptación y herramientas (secciones 5 y 6); recursos y cronograma (secciones 7 y 8); diseño de casos de prueba (sección 9); matriz de trazabilidad entre requerimientos, pruebas y controles normativos (sección 10); y análisis de cobertura y coherencia del plan (sección 11).</w:t>
       </w:r>
     </w:p>
     <w:p>
@@ -2205,7 +2223,7 @@
         <w:pStyle w:val="Heading1"/>
         <w:rPr/>
       </w:pPr>
-      <w:bookmarkStart w:id="6" w:name="__RefHeading___Toc3438_2538103707"/>
+      <w:bookmarkStart w:id="6" w:name="__RefHeading___Toc3444_158910726"/>
       <w:bookmarkEnd w:id="6"/>
       <w:r>
         <w:rPr>
@@ -2227,7 +2245,7 @@
           <w:sz w:val="22"/>
           <w:szCs w:val="22"/>
         </w:rPr>
-        <w:t>La calidad, la seguridad y el cumplimiento legal no se tratan como dimensiones separadas. Un defecto de control de acceso en Atlas es a la vez un problema de calidad (el sistema no hace lo especificado), de seguridad (se rompe la confidencialidad) y legal (se vulnera el deber de resguardo de datos personales). Por eso cada criterio de esta sección se vincula con un requerimiento de la ERS y con una referencia normativa.</w:t>
+        <w:t>En Atlas, calidad, seguridad y cumplimiento legal están conectados. Por ejemplo, una falla en el control de acceso es un problema de calidad (el sistema no hace lo especificado), de seguridad (se pierde la confidencialidad) y legal (no se resguardan los datos personales). Por eso cada criterio de esta sección está ligado a un requerimiento de la ERS y a una referencia normativa.</w:t>
       </w:r>
     </w:p>
     <w:p>
@@ -2235,7 +2253,7 @@
         <w:pStyle w:val="Heading2"/>
         <w:rPr/>
       </w:pPr>
-      <w:bookmarkStart w:id="7" w:name="__RefHeading___Toc3440_2538103707"/>
+      <w:bookmarkStart w:id="7" w:name="__RefHeading___Toc3446_158910726"/>
       <w:bookmarkEnd w:id="7"/>
       <w:r>
         <w:rPr>
@@ -3277,7 +3295,7 @@
         <w:pStyle w:val="Heading2"/>
         <w:rPr/>
       </w:pPr>
-      <w:bookmarkStart w:id="8" w:name="__RefHeading___Toc3442_2538103707"/>
+      <w:bookmarkStart w:id="8" w:name="__RefHeading___Toc3448_158910726"/>
       <w:bookmarkEnd w:id="8"/>
       <w:r>
         <w:rPr>
@@ -3299,7 +3317,7 @@
           <w:sz w:val="22"/>
           <w:szCs w:val="22"/>
         </w:rPr>
-        <w:t>Los criterios de seguridad se basan en la tríada de confidencialidad, integridad y disponibilidad, y se contrastan con OWASP Top 10 (2021) y OWASP ASVS 4.0 nivel 2, nivel recomendado para aplicaciones que manejan datos personales y financieros.</w:t>
+        <w:t>Tomamos como base la tríada confidencialidad, integridad y disponibilidad, y contrastamos cada criterio con OWASP Top 10 (2021) y OWASP ASVS 4.0 nivel 2, que es el nivel recomendado para aplicaciones con datos personales y financieros.</w:t>
       </w:r>
     </w:p>
     <w:tbl>
@@ -4335,7 +4353,7 @@
         <w:pStyle w:val="Heading2"/>
         <w:rPr/>
       </w:pPr>
-      <w:bookmarkStart w:id="9" w:name="__RefHeading___Toc3444_2538103707"/>
+      <w:bookmarkStart w:id="9" w:name="__RefHeading___Toc3450_158910726"/>
       <w:bookmarkEnd w:id="9"/>
       <w:r>
         <w:rPr>
@@ -5221,7 +5239,7 @@
         <w:pStyle w:val="Heading2"/>
         <w:rPr/>
       </w:pPr>
-      <w:bookmarkStart w:id="10" w:name="__RefHeading___Toc3446_2538103707"/>
+      <w:bookmarkStart w:id="10" w:name="__RefHeading___Toc3452_158910726"/>
       <w:bookmarkEnd w:id="10"/>
       <w:r>
         <w:rPr>
@@ -5243,7 +5261,7 @@
           <w:sz w:val="22"/>
           <w:szCs w:val="22"/>
         </w:rPr>
-        <w:t>Durante el análisis se detectaron puntos que conviene aclarar con el cliente antes de ejecutar las pruebas, porque afectan directamente los criterios de aceptación:</w:t>
+        <w:t>Al revisar la ERS encontramos puntos que conviene aclarar con el cliente antes de ejecutar las pruebas, ya que afectan los criterios de aceptación:</w:t>
       </w:r>
     </w:p>
     <w:p>
@@ -5384,7 +5402,7 @@
         <w:spacing w:before="0" w:after="180"/>
         <w:rPr/>
       </w:pPr>
-      <w:bookmarkStart w:id="11" w:name="__RefHeading___Toc3448_2538103707"/>
+      <w:bookmarkStart w:id="11" w:name="__RefHeading___Toc3454_158910726"/>
       <w:bookmarkEnd w:id="11"/>
       <w:r>
         <w:rPr>
@@ -5406,7 +5424,7 @@
           <w:sz w:val="22"/>
           <w:szCs w:val="22"/>
         </w:rPr>
-        <w:t>Las pruebas se clasifican en funcionales, que verifican qué hace el sistema, y no funcionales, que verifican cómo lo hace. Las pruebas de seguridad se tratan como una categoría propia por el tipo de datos que maneja Atlas y por su peso en el cumplimiento legal.</w:t>
+        <w:t>Separamos las pruebas en funcionales (qué hace el sistema) y no funcionales (cómo lo hace). Las de seguridad van en un grupo aparte por el tipo de datos que maneja Atlas y su peso en el cumplimiento legal.</w:t>
       </w:r>
     </w:p>
     <w:p>
@@ -5414,7 +5432,7 @@
         <w:pStyle w:val="Heading2"/>
         <w:rPr/>
       </w:pPr>
-      <w:bookmarkStart w:id="12" w:name="__RefHeading___Toc3450_2538103707"/>
+      <w:bookmarkStart w:id="12" w:name="__RefHeading___Toc3456_158910726"/>
       <w:bookmarkEnd w:id="12"/>
       <w:r>
         <w:rPr>
@@ -6347,7 +6365,7 @@
         <w:pStyle w:val="Heading2"/>
         <w:rPr/>
       </w:pPr>
-      <w:bookmarkStart w:id="13" w:name="__RefHeading___Toc3452_2538103707"/>
+      <w:bookmarkStart w:id="13" w:name="__RefHeading___Toc3458_158910726"/>
       <w:bookmarkEnd w:id="13"/>
       <w:r>
         <w:rPr>
@@ -7389,7 +7407,7 @@
         <w:pStyle w:val="Heading2"/>
         <w:rPr/>
       </w:pPr>
-      <w:bookmarkStart w:id="14" w:name="__RefHeading___Toc3454_2538103707"/>
+      <w:bookmarkStart w:id="14" w:name="__RefHeading___Toc3460_158910726"/>
       <w:bookmarkEnd w:id="14"/>
       <w:r>
         <w:rPr>
@@ -8431,7 +8449,7 @@
         <w:pStyle w:val="Heading2"/>
         <w:rPr/>
       </w:pPr>
-      <w:bookmarkStart w:id="15" w:name="__RefHeading___Toc3456_2538103707"/>
+      <w:bookmarkStart w:id="15" w:name="__RefHeading___Toc3462_158910726"/>
       <w:bookmarkEnd w:id="15"/>
       <w:r>
         <w:rPr>
@@ -8453,7 +8471,87 @@
           <w:sz w:val="22"/>
           <w:szCs w:val="22"/>
         </w:rPr>
-        <w:t>La combinación responde al perfil de riesgo del producto. Atlas es transaccional y multiempresa, por lo que un error de autorización tiene impacto directo sobre datos de terceros; por eso las pruebas de control de acceso tienen prioridad alta y se automatizan. El público adulto mayor justifica pruebas de usabilidad con usuarios reales, que ninguna herramienta automática reemplaza. Los umbrales numéricos de NFR-PERF solo pueden demostrarse con pruebas de carga medibles, y la obligación legal de proteger datos personales exige evidencias de cifrado, trazabilidad y ausencia de vulnerabilidades críticas.</w:t>
+        <w:t>Elegimos esta combinación según el riesgo del producto:</w:t>
+      </w:r>
+    </w:p>
+    <w:p>
+      <w:pPr>
+        <w:pStyle w:val="ListParagraph"/>
+        <w:numPr>
+          <w:ilvl w:val="0"/>
+          <w:numId w:val="1"/>
+        </w:numPr>
+        <w:spacing w:lineRule="exact" w:line="360" w:before="0" w:after="60"/>
+        <w:jc w:val="both"/>
+        <w:rPr/>
+      </w:pPr>
+      <w:r>
+        <w:rPr>
+          <w:rFonts w:eastAsia="Arial" w:cs="Arial"/>
+          <w:sz w:val="22"/>
+          <w:szCs w:val="22"/>
+        </w:rPr>
+        <w:t>Atlas es transaccional y multiempresa, así que un error de autorización expone datos de terceros. Por eso las pruebas de control de acceso tienen prioridad alta y se automatizan.</w:t>
+      </w:r>
+    </w:p>
+    <w:p>
+      <w:pPr>
+        <w:pStyle w:val="ListParagraph"/>
+        <w:numPr>
+          <w:ilvl w:val="0"/>
+          <w:numId w:val="1"/>
+        </w:numPr>
+        <w:spacing w:lineRule="exact" w:line="360" w:before="0" w:after="60"/>
+        <w:jc w:val="both"/>
+        <w:rPr/>
+      </w:pPr>
+      <w:r>
+        <w:rPr>
+          <w:rFonts w:eastAsia="Arial" w:cs="Arial"/>
+          <w:sz w:val="22"/>
+          <w:szCs w:val="22"/>
+        </w:rPr>
+        <w:t>El público adulto mayor requiere pruebas de usabilidad con usuarios reales; ninguna herramienta automática las reemplaza.</w:t>
+      </w:r>
+    </w:p>
+    <w:p>
+      <w:pPr>
+        <w:pStyle w:val="ListParagraph"/>
+        <w:numPr>
+          <w:ilvl w:val="0"/>
+          <w:numId w:val="1"/>
+        </w:numPr>
+        <w:spacing w:lineRule="exact" w:line="360" w:before="0" w:after="60"/>
+        <w:jc w:val="both"/>
+        <w:rPr/>
+      </w:pPr>
+      <w:r>
+        <w:rPr>
+          <w:rFonts w:eastAsia="Arial" w:cs="Arial"/>
+          <w:sz w:val="22"/>
+          <w:szCs w:val="22"/>
+        </w:rPr>
+        <w:t>Los umbrales de NFR-PERF solo se pueden demostrar con pruebas de carga medibles.</w:t>
+      </w:r>
+    </w:p>
+    <w:p>
+      <w:pPr>
+        <w:pStyle w:val="ListParagraph"/>
+        <w:numPr>
+          <w:ilvl w:val="0"/>
+          <w:numId w:val="1"/>
+        </w:numPr>
+        <w:spacing w:lineRule="exact" w:line="360" w:before="0" w:after="60"/>
+        <w:jc w:val="both"/>
+        <w:rPr/>
+      </w:pPr>
+      <w:r>
+        <w:rPr>
+          <w:rFonts w:eastAsia="Arial" w:cs="Arial"/>
+          <w:sz w:val="22"/>
+          <w:szCs w:val="22"/>
+        </w:rPr>
+        <w:t>La protección de datos personales exige evidencia de cifrado, trazabilidad y ausencia de vulnerabilidades críticas.</w:t>
       </w:r>
     </w:p>
     <w:p>
@@ -8461,7 +8559,7 @@
         <w:pStyle w:val="Heading1"/>
         <w:rPr/>
       </w:pPr>
-      <w:bookmarkStart w:id="16" w:name="__RefHeading___Toc3458_2538103707"/>
+      <w:bookmarkStart w:id="16" w:name="__RefHeading___Toc3464_158910726"/>
       <w:bookmarkEnd w:id="16"/>
       <w:r>
         <w:rPr>
@@ -8475,7 +8573,7 @@
         <w:pStyle w:val="Heading2"/>
         <w:rPr/>
       </w:pPr>
-      <w:bookmarkStart w:id="17" w:name="__RefHeading___Toc3460_2538103707"/>
+      <w:bookmarkStart w:id="17" w:name="__RefHeading___Toc3466_158910726"/>
       <w:bookmarkEnd w:id="17"/>
       <w:r>
         <w:rPr>
@@ -8497,7 +8595,7 @@
           <w:sz w:val="22"/>
           <w:szCs w:val="22"/>
         </w:rPr>
-        <w:t xml:space="preserve">Se adopta un </w:t>
+        <w:t xml:space="preserve">Usamos un </w:t>
       </w:r>
       <w:r>
         <w:rPr>
@@ -8515,7 +8613,7 @@
           <w:sz w:val="22"/>
           <w:szCs w:val="22"/>
         </w:rPr>
-        <w:t>. Las pruebas repetitivas y de regresión (unitarias, API, control de acceso, rendimiento y análisis de seguridad automatizado) se automatizan e integran al pipeline de integración continua. Las pruebas que requieren criterio humano (usabilidad, accesibilidad con lector de pantalla, exploratorias y de penetración manual) se ejecutan de forma manual.</w:t>
+        <w:t>. Lo repetitivo (unitarias, API, control de acceso, rendimiento, regresión y análisis de seguridad automatizado) se automatiza y corre en el pipeline de integración continua. Lo que necesita criterio humano (usabilidad, accesibilidad con lector de pantalla, pruebas exploratorias y pentest manual) se ejecuta a mano.</w:t>
       </w:r>
     </w:p>
     <w:p>
@@ -8531,7 +8629,7 @@
           <w:sz w:val="22"/>
           <w:szCs w:val="22"/>
         </w:rPr>
-        <w:t>La estrategia sigue el principio de *shift-left*: la seguridad y la calidad se verifican desde el inicio del desarrollo y no solo al final, lo que es coherente con la exigencia de seguridad por diseño de la Ley 21.663 y con la responsabilidad proactiva de la Ley 21.719.</w:t>
+        <w:t>Aplicamos *shift-left*: calidad y seguridad se verifican desde el inicio del desarrollo y no solo al final. Esto va en línea con la seguridad por diseño de la Ley 21.663 y la responsabilidad proactiva de la Ley 21.719.</w:t>
       </w:r>
     </w:p>
     <w:p>
@@ -8539,7 +8637,7 @@
         <w:pStyle w:val="Heading2"/>
         <w:rPr/>
       </w:pPr>
-      <w:bookmarkStart w:id="18" w:name="__RefHeading___Toc3462_2538103707"/>
+      <w:bookmarkStart w:id="18" w:name="__RefHeading___Toc3468_158910726"/>
       <w:bookmarkEnd w:id="18"/>
       <w:r>
         <w:rPr>
@@ -8561,7 +8659,7 @@
           <w:sz w:val="22"/>
           <w:szCs w:val="22"/>
         </w:rPr>
-        <w:t>El proceso se basa en ISO/IEC/IEEE 29119 y se organiza en cinco etapas:</w:t>
+        <w:t>Tomando como referencia ISO/IEC/IEEE 29119, el proceso tiene cinco etapas:</w:t>
       </w:r>
     </w:p>
     <w:tbl>
@@ -9109,7 +9207,7 @@
         <w:pStyle w:val="Heading2"/>
         <w:rPr/>
       </w:pPr>
-      <w:bookmarkStart w:id="19" w:name="__RefHeading___Toc3464_2538103707"/>
+      <w:bookmarkStart w:id="19" w:name="__RefHeading___Toc3470_158910726"/>
       <w:bookmarkEnd w:id="19"/>
       <w:r>
         <w:rPr>
@@ -9131,7 +9229,7 @@
           <w:sz w:val="22"/>
           <w:szCs w:val="22"/>
         </w:rPr>
-        <w:t>La prioridad se calcula como probabilidad por impacto, considerando la criticidad legal del dato involucrado.</w:t>
+        <w:t>La prioridad se obtiene de probabilidad × impacto, considerando además qué tan sensible es el dato involucrado.</w:t>
       </w:r>
     </w:p>
     <w:tbl>
@@ -10276,7 +10374,7 @@
         <w:pStyle w:val="Heading2"/>
         <w:rPr/>
       </w:pPr>
-      <w:bookmarkStart w:id="20" w:name="__RefHeading___Toc3466_2538103707"/>
+      <w:bookmarkStart w:id="20" w:name="__RefHeading___Toc3472_158910726"/>
       <w:bookmarkEnd w:id="20"/>
       <w:r>
         <w:rPr>
@@ -10410,7 +10508,7 @@
         <w:pStyle w:val="Heading2"/>
         <w:rPr/>
       </w:pPr>
-      <w:bookmarkStart w:id="21" w:name="__RefHeading___Toc3468_2538103707"/>
+      <w:bookmarkStart w:id="21" w:name="__RefHeading___Toc3474_158910726"/>
       <w:bookmarkEnd w:id="21"/>
       <w:r>
         <w:rPr>
@@ -10572,7 +10670,7 @@
         <w:pStyle w:val="Heading2"/>
         <w:rPr/>
       </w:pPr>
-      <w:bookmarkStart w:id="22" w:name="__RefHeading___Toc3470_2538103707"/>
+      <w:bookmarkStart w:id="22" w:name="__RefHeading___Toc3476_158910726"/>
       <w:bookmarkEnd w:id="22"/>
       <w:r>
         <w:rPr>
@@ -10602,7 +10700,7 @@
         <w:pStyle w:val="Heading2"/>
         <w:rPr/>
       </w:pPr>
-      <w:bookmarkStart w:id="23" w:name="__RefHeading___Toc3472_2538103707"/>
+      <w:bookmarkStart w:id="23" w:name="__RefHeading___Toc3478_158910726"/>
       <w:bookmarkEnd w:id="23"/>
       <w:r>
         <w:rPr>
@@ -10632,7 +10730,7 @@
         <w:pStyle w:val="Heading1"/>
         <w:rPr/>
       </w:pPr>
-      <w:bookmarkStart w:id="24" w:name="__RefHeading___Toc3474_2538103707"/>
+      <w:bookmarkStart w:id="24" w:name="__RefHeading___Toc3480_158910726"/>
       <w:bookmarkEnd w:id="24"/>
       <w:r>
         <w:rPr>
@@ -10654,7 +10752,7 @@
           <w:sz w:val="22"/>
           <w:szCs w:val="22"/>
         </w:rPr>
-        <w:t xml:space="preserve">Estos criterios se aplican a todos los casos de prueba, además del criterio específico de cada caso. Un caso se considera </w:t>
+        <w:t xml:space="preserve">Estos criterios aplican a todos los casos, además del criterio propio de cada uno. Un caso queda </w:t>
       </w:r>
       <w:r>
         <w:rPr>
@@ -10672,7 +10770,7 @@
           <w:sz w:val="22"/>
           <w:szCs w:val="22"/>
         </w:rPr>
-        <w:t xml:space="preserve"> solo si cumple su resultado esperado y no infringe ninguno de los criterios transversales.</w:t>
+        <w:t xml:space="preserve"> solo si obtiene el resultado esperado y no incumple ninguno de los puntos siguientes.</w:t>
       </w:r>
     </w:p>
     <w:p>
@@ -10680,7 +10778,7 @@
         <w:pStyle w:val="Heading2"/>
         <w:rPr/>
       </w:pPr>
-      <w:bookmarkStart w:id="25" w:name="__RefHeading___Toc3476_2538103707"/>
+      <w:bookmarkStart w:id="25" w:name="__RefHeading___Toc3482_158910726"/>
       <w:bookmarkEnd w:id="25"/>
       <w:r>
         <w:rPr>
@@ -10774,7 +10872,7 @@
         <w:pStyle w:val="Heading2"/>
         <w:rPr/>
       </w:pPr>
-      <w:bookmarkStart w:id="26" w:name="__RefHeading___Toc3478_2538103707"/>
+      <w:bookmarkStart w:id="26" w:name="__RefHeading___Toc3484_158910726"/>
       <w:bookmarkEnd w:id="26"/>
       <w:r>
         <w:rPr>
@@ -10868,7 +10966,7 @@
         <w:pStyle w:val="Heading2"/>
         <w:rPr/>
       </w:pPr>
-      <w:bookmarkStart w:id="27" w:name="__RefHeading___Toc3480_2538103707"/>
+      <w:bookmarkStart w:id="27" w:name="__RefHeading___Toc3486_158910726"/>
       <w:bookmarkEnd w:id="27"/>
       <w:r>
         <w:rPr>
@@ -10982,7 +11080,7 @@
         <w:pStyle w:val="Heading2"/>
         <w:rPr/>
       </w:pPr>
-      <w:bookmarkStart w:id="28" w:name="__RefHeading___Toc3482_2538103707"/>
+      <w:bookmarkStart w:id="28" w:name="__RefHeading___Toc3488_158910726"/>
       <w:bookmarkEnd w:id="28"/>
       <w:r>
         <w:rPr>
@@ -11076,7 +11174,7 @@
         <w:pStyle w:val="Heading2"/>
         <w:rPr/>
       </w:pPr>
-      <w:bookmarkStart w:id="29" w:name="__RefHeading___Toc3484_2538103707"/>
+      <w:bookmarkStart w:id="29" w:name="__RefHeading___Toc3490_158910726"/>
       <w:bookmarkEnd w:id="29"/>
       <w:r>
         <w:rPr>
@@ -11547,7 +11645,7 @@
         <w:pStyle w:val="Heading1"/>
         <w:rPr/>
       </w:pPr>
-      <w:bookmarkStart w:id="30" w:name="__RefHeading___Toc3486_2538103707"/>
+      <w:bookmarkStart w:id="30" w:name="__RefHeading___Toc3492_158910726"/>
       <w:bookmarkEnd w:id="30"/>
       <w:r>
         <w:rPr>
@@ -13570,7 +13668,7 @@
         <w:pStyle w:val="Heading1"/>
         <w:rPr/>
       </w:pPr>
-      <w:bookmarkStart w:id="31" w:name="__RefHeading___Toc3488_2538103707"/>
+      <w:bookmarkStart w:id="31" w:name="__RefHeading___Toc3494_158910726"/>
       <w:bookmarkEnd w:id="31"/>
       <w:r>
         <w:rPr>
@@ -13584,7 +13682,7 @@
         <w:pStyle w:val="Heading2"/>
         <w:rPr/>
       </w:pPr>
-      <w:bookmarkStart w:id="32" w:name="__RefHeading___Toc3490_2538103707"/>
+      <w:bookmarkStart w:id="32" w:name="__RefHeading___Toc3496_158910726"/>
       <w:bookmarkEnd w:id="32"/>
       <w:r>
         <w:rPr>
@@ -14553,7 +14651,7 @@
         <w:pStyle w:val="Heading2"/>
         <w:rPr/>
       </w:pPr>
-      <w:bookmarkStart w:id="33" w:name="__RefHeading___Toc3492_2538103707"/>
+      <w:bookmarkStart w:id="33" w:name="__RefHeading___Toc3498_158910726"/>
       <w:bookmarkEnd w:id="33"/>
       <w:r>
         <w:rPr>
@@ -14717,7 +14815,7 @@
         <w:pStyle w:val="Heading2"/>
         <w:rPr/>
       </w:pPr>
-      <w:bookmarkStart w:id="34" w:name="__RefHeading___Toc3494_2538103707"/>
+      <w:bookmarkStart w:id="34" w:name="__RefHeading___Toc3500_158910726"/>
       <w:bookmarkEnd w:id="34"/>
       <w:r>
         <w:rPr>
@@ -15196,7 +15294,7 @@
           <w:sz w:val="22"/>
           <w:szCs w:val="22"/>
         </w:rPr>
-        <w:t>Los datos personales reales no se usan en ningún ambiente de prueba. Esta decisión responde al principio de minimización de la Ley 21.719 y evita que un ambiente con menos controles se convierta en una fuente de filtración.</w:t>
+        <w:t>En ningún ambiente de prueba se usan datos personales reales. Así aplicamos el principio de minimización de la Ley 21.719 y evitamos que un ambiente con menos controles termine filtrando información.</w:t>
       </w:r>
     </w:p>
     <w:p>
@@ -15204,7 +15302,7 @@
         <w:pStyle w:val="Heading1"/>
         <w:rPr/>
       </w:pPr>
-      <w:bookmarkStart w:id="35" w:name="__RefHeading___Toc3496_2538103707"/>
+      <w:bookmarkStart w:id="35" w:name="__RefHeading___Toc3502_158910726"/>
       <w:bookmarkEnd w:id="35"/>
       <w:r>
         <w:rPr>
@@ -15226,7 +15324,7 @@
           <w:sz w:val="22"/>
           <w:szCs w:val="22"/>
         </w:rPr>
-        <w:t>Planificación referencial de seis semanas, alineada con las etapas de la sección 4.2.</w:t>
+        <w:t>Proponemos un cronograma de referencia de seis semanas, siguiendo las etapas de la sección 4.2.</w:t>
       </w:r>
     </w:p>
     <w:tbl>
@@ -16260,7 +16358,7 @@
         <w:spacing w:before="0" w:after="180"/>
         <w:rPr/>
       </w:pPr>
-      <w:bookmarkStart w:id="36" w:name="__RefHeading___Toc3498_2538103707"/>
+      <w:bookmarkStart w:id="36" w:name="__RefHeading___Toc3504_158910726"/>
       <w:bookmarkEnd w:id="36"/>
       <w:r>
         <w:rPr>
@@ -16282,7 +16380,7 @@
           <w:sz w:val="22"/>
           <w:szCs w:val="22"/>
         </w:rPr>
-        <w:t>Se diseñaron trece casos representativos que cubren requerimientos funcionales, reglas de negocio y requerimientos no funcionales de seguridad, rendimiento, usabilidad, accesibilidad y compatibilidad. Los códigos de requerimiento corresponden a la ERS v1.1 de Atlas.</w:t>
+        <w:t>Diseñamos trece casos que cubren requerimientos funcionales, reglas de negocio y requerimientos no funcionales de seguridad, rendimiento, usabilidad, accesibilidad y compatibilidad. Los códigos de requerimiento son los de la ERS v1.1.</w:t>
       </w:r>
     </w:p>
     <w:p>
@@ -16290,7 +16388,7 @@
         <w:pStyle w:val="Heading2"/>
         <w:rPr/>
       </w:pPr>
-      <w:bookmarkStart w:id="37" w:name="__RefHeading___Toc3500_2538103707"/>
+      <w:bookmarkStart w:id="37" w:name="__RefHeading___Toc3506_158910726"/>
       <w:bookmarkEnd w:id="37"/>
       <w:r>
         <w:rPr>
@@ -17015,7 +17113,7 @@
         <w:pStyle w:val="Heading2"/>
         <w:rPr/>
       </w:pPr>
-      <w:bookmarkStart w:id="38" w:name="__RefHeading___Toc3502_2538103707"/>
+      <w:bookmarkStart w:id="38" w:name="__RefHeading___Toc3508_158910726"/>
       <w:bookmarkEnd w:id="38"/>
       <w:r>
         <w:rPr>
@@ -17740,7 +17838,7 @@
         <w:pStyle w:val="Heading2"/>
         <w:rPr/>
       </w:pPr>
-      <w:bookmarkStart w:id="39" w:name="__RefHeading___Toc3504_2538103707"/>
+      <w:bookmarkStart w:id="39" w:name="__RefHeading___Toc3510_158910726"/>
       <w:bookmarkEnd w:id="39"/>
       <w:r>
         <w:rPr>
@@ -18495,7 +18593,7 @@
         <w:pStyle w:val="Heading2"/>
         <w:rPr/>
       </w:pPr>
-      <w:bookmarkStart w:id="40" w:name="__RefHeading___Toc3506_2538103707"/>
+      <w:bookmarkStart w:id="40" w:name="__RefHeading___Toc3512_158910726"/>
       <w:bookmarkEnd w:id="40"/>
       <w:r>
         <w:rPr>
@@ -19235,7 +19333,7 @@
         <w:pStyle w:val="Heading2"/>
         <w:rPr/>
       </w:pPr>
-      <w:bookmarkStart w:id="41" w:name="__RefHeading___Toc3508_2538103707"/>
+      <w:bookmarkStart w:id="41" w:name="__RefHeading___Toc3514_158910726"/>
       <w:bookmarkEnd w:id="41"/>
       <w:r>
         <w:rPr>
@@ -19975,7 +20073,7 @@
         <w:pStyle w:val="Heading2"/>
         <w:rPr/>
       </w:pPr>
-      <w:bookmarkStart w:id="42" w:name="__RefHeading___Toc3510_2538103707"/>
+      <w:bookmarkStart w:id="42" w:name="__RefHeading___Toc3516_158910726"/>
       <w:bookmarkEnd w:id="42"/>
       <w:r>
         <w:rPr>
@@ -20730,7 +20828,7 @@
         <w:pStyle w:val="Heading2"/>
         <w:rPr/>
       </w:pPr>
-      <w:bookmarkStart w:id="43" w:name="__RefHeading___Toc3512_2538103707"/>
+      <w:bookmarkStart w:id="43" w:name="__RefHeading___Toc3518_158910726"/>
       <w:bookmarkEnd w:id="43"/>
       <w:r>
         <w:rPr>
@@ -21440,7 +21538,7 @@
         <w:pStyle w:val="Heading2"/>
         <w:rPr/>
       </w:pPr>
-      <w:bookmarkStart w:id="44" w:name="__RefHeading___Toc3514_2538103707"/>
+      <w:bookmarkStart w:id="44" w:name="__RefHeading___Toc3520_158910726"/>
       <w:bookmarkEnd w:id="44"/>
       <w:r>
         <w:rPr>
@@ -22198,7 +22296,7 @@
         <w:pStyle w:val="Heading2"/>
         <w:rPr/>
       </w:pPr>
-      <w:bookmarkStart w:id="45" w:name="__RefHeading___Toc3516_2538103707"/>
+      <w:bookmarkStart w:id="45" w:name="__RefHeading___Toc3522_158910726"/>
       <w:bookmarkEnd w:id="45"/>
       <w:r>
         <w:rPr>
@@ -22938,7 +23036,7 @@
         <w:pStyle w:val="Heading2"/>
         <w:rPr/>
       </w:pPr>
-      <w:bookmarkStart w:id="46" w:name="__RefHeading___Toc3518_2538103707"/>
+      <w:bookmarkStart w:id="46" w:name="__RefHeading___Toc3524_158910726"/>
       <w:bookmarkEnd w:id="46"/>
       <w:r>
         <w:rPr>
@@ -23663,7 +23761,7 @@
         <w:pStyle w:val="Heading2"/>
         <w:rPr/>
       </w:pPr>
-      <w:bookmarkStart w:id="47" w:name="__RefHeading___Toc3520_2538103707"/>
+      <w:bookmarkStart w:id="47" w:name="__RefHeading___Toc3526_158910726"/>
       <w:bookmarkEnd w:id="47"/>
       <w:r>
         <w:rPr>
@@ -24388,7 +24486,7 @@
         <w:pStyle w:val="Heading2"/>
         <w:rPr/>
       </w:pPr>
-      <w:bookmarkStart w:id="48" w:name="__RefHeading___Toc3522_2538103707"/>
+      <w:bookmarkStart w:id="48" w:name="__RefHeading___Toc3528_158910726"/>
       <w:bookmarkEnd w:id="48"/>
       <w:r>
         <w:rPr>
@@ -25136,7 +25234,7 @@
         <w:pStyle w:val="Heading2"/>
         <w:rPr/>
       </w:pPr>
-      <w:bookmarkStart w:id="49" w:name="__RefHeading___Toc3524_2538103707"/>
+      <w:bookmarkStart w:id="49" w:name="__RefHeading___Toc3530_158910726"/>
       <w:bookmarkEnd w:id="49"/>
       <w:r>
         <w:rPr>
@@ -25859,7 +25957,7 @@
         <w:spacing w:before="0" w:after="180"/>
         <w:rPr/>
       </w:pPr>
-      <w:bookmarkStart w:id="50" w:name="__RefHeading___Toc3526_2538103707"/>
+      <w:bookmarkStart w:id="50" w:name="__RefHeading___Toc3532_158910726"/>
       <w:bookmarkEnd w:id="50"/>
       <w:r>
         <w:rPr>
@@ -25881,7 +25979,7 @@
           <w:sz w:val="22"/>
           <w:szCs w:val="22"/>
         </w:rPr>
-        <w:t>La matriz relaciona cada requerimiento de la ERS con los casos de prueba que lo verifican, el tipo de prueba y el control normativo o estándar que respalda. Los requerimientos sin caso detallado en esta iteración se cubren con la suite indicada y se registran para la iteración 2.</w:t>
+        <w:t>La matriz vincula cada requerimiento de la ERS con los casos que lo verifican, el tipo de prueba y la norma o estándar relacionado. Los requerimientos que todavía no tienen caso detallado se cubren con la suite indicada y quedan anotados para la iteración 2.</w:t>
       </w:r>
     </w:p>
     <w:p>
@@ -25889,7 +25987,7 @@
         <w:pStyle w:val="Heading2"/>
         <w:rPr/>
       </w:pPr>
-      <w:bookmarkStart w:id="51" w:name="__RefHeading___Toc3528_2538103707"/>
+      <w:bookmarkStart w:id="51" w:name="__RefHeading___Toc3534_158910726"/>
       <w:bookmarkEnd w:id="51"/>
       <w:r>
         <w:rPr>
@@ -29060,7 +29158,7 @@
         <w:pStyle w:val="Heading2"/>
         <w:rPr/>
       </w:pPr>
-      <w:bookmarkStart w:id="52" w:name="__RefHeading___Toc3530_2538103707"/>
+      <w:bookmarkStart w:id="52" w:name="__RefHeading___Toc3536_158910726"/>
       <w:bookmarkEnd w:id="52"/>
       <w:r>
         <w:rPr>
@@ -32244,7 +32342,7 @@
         <w:spacing w:before="0" w:after="180"/>
         <w:rPr/>
       </w:pPr>
-      <w:bookmarkStart w:id="53" w:name="__RefHeading___Toc3532_2538103707"/>
+      <w:bookmarkStart w:id="53" w:name="__RefHeading___Toc3538_158910726"/>
       <w:bookmarkEnd w:id="53"/>
       <w:r>
         <w:rPr>
@@ -32258,7 +32356,7 @@
         <w:pStyle w:val="Heading2"/>
         <w:rPr/>
       </w:pPr>
-      <w:bookmarkStart w:id="54" w:name="__RefHeading___Toc3534_2538103707"/>
+      <w:bookmarkStart w:id="54" w:name="__RefHeading___Toc3540_158910726"/>
       <w:bookmarkEnd w:id="54"/>
       <w:r>
         <w:rPr>
@@ -33557,7 +33655,7 @@
           <w:sz w:val="22"/>
           <w:szCs w:val="22"/>
         </w:rPr>
-        <w:t>Todos los requerimientos de la ERS quedan trazados. El 88 % cuenta con un caso de prueba documentado en esta iteración y el resto se cubre mediante suites de regresión o actividades específicas que se detallarán como casos en la iteración 2.</w:t>
+        <w:t>Todos los requerimientos de la ERS quedan trazados. El 88 % ya tiene un caso documentado; el resto se cubre con suites de regresión o actividades puntuales que detallaremos como casos en la iteración 2.</w:t>
       </w:r>
     </w:p>
     <w:p>
@@ -33565,7 +33663,7 @@
         <w:pStyle w:val="Heading2"/>
         <w:rPr/>
       </w:pPr>
-      <w:bookmarkStart w:id="55" w:name="__RefHeading___Toc3536_2538103707"/>
+      <w:bookmarkStart w:id="55" w:name="__RefHeading___Toc3542_158910726"/>
       <w:bookmarkEnd w:id="55"/>
       <w:r>
         <w:rPr>
@@ -33961,7 +34059,7 @@
           <w:sz w:val="22"/>
           <w:szCs w:val="22"/>
         </w:rPr>
-        <w:t>El peso de las pruebas de seguridad es deliberado: los cinco riesgos P1 identificados en la sección 4.3 tienen al menos un caso asociado, y todos ellos involucran datos personales o bancarios.</w:t>
+        <w:t>Las pruebas de seguridad tienen más peso a propósito: cada riesgo P1 de la sección 4.3 tiene al menos un caso asociado, y todos involucran datos personales o bancarios.</w:t>
       </w:r>
     </w:p>
     <w:p>
@@ -33969,7 +34067,7 @@
         <w:pStyle w:val="Heading2"/>
         <w:rPr/>
       </w:pPr>
-      <w:bookmarkStart w:id="56" w:name="__RefHeading___Toc3538_2538103707"/>
+      <w:bookmarkStart w:id="56" w:name="__RefHeading___Toc3544_158910726"/>
       <w:bookmarkEnd w:id="56"/>
       <w:r>
         <w:rPr>
@@ -34103,7 +34201,7 @@
         <w:pStyle w:val="Heading2"/>
         <w:rPr/>
       </w:pPr>
-      <w:bookmarkStart w:id="57" w:name="__RefHeading___Toc3540_2538103707"/>
+      <w:bookmarkStart w:id="57" w:name="__RefHeading___Toc3546_158910726"/>
       <w:bookmarkEnd w:id="57"/>
       <w:r>
         <w:rPr>
@@ -34740,7 +34838,7 @@
         <w:pStyle w:val="Heading2"/>
         <w:rPr/>
       </w:pPr>
-      <w:bookmarkStart w:id="58" w:name="__RefHeading___Toc3542_2538103707"/>
+      <w:bookmarkStart w:id="58" w:name="__RefHeading___Toc3548_158910726"/>
       <w:bookmarkEnd w:id="58"/>
       <w:r>
         <w:rPr>
@@ -34762,7 +34860,23 @@
           <w:sz w:val="22"/>
           <w:szCs w:val="22"/>
         </w:rPr>
-        <w:t>El plan es coherente con la naturaleza de Atlas: un sistema multiempresa que trata datos personales y bancarios de terceros. La estrategia mixta basada en riesgo concentra el esfuerzo en el control de acceso y la protección de datos, sin descuidar el rendimiento y la usabilidad para adultos mayores que la ERS declara como prioritarios. La trazabilidad completa entre requerimientos, casos y controles normativos permite, además de detectar defectos, reunir evidencia de cumplimiento frente a la Ley 19.628, la Ley 21.719 y los estándares ISO/IEC y OWASP. Las brechas detectadas en la propia ERS se documentan como insumo para la siguiente iteración del caso semestral.</w:t>
+        <w:t>Atlas es un sistema multiempresa que maneja datos personales y bancarios de terceros, y el plan responde a eso. La estrategia basada en riesgo pone el mayor esfuerzo en control de acceso y protección de datos, sin dejar de lado el rendimiento ni la usabilidad para adultos mayores, que la ERS marca como prioritarios.</w:t>
+      </w:r>
+    </w:p>
+    <w:p>
+      <w:pPr>
+        <w:pStyle w:val="Normal"/>
+        <w:spacing w:lineRule="exact" w:line="360" w:before="0" w:after="120"/>
+        <w:jc w:val="both"/>
+        <w:rPr/>
+      </w:pPr>
+      <w:r>
+        <w:rPr>
+          <w:rFonts w:eastAsia="Arial" w:cs="Arial"/>
+          <w:sz w:val="22"/>
+          <w:szCs w:val="22"/>
+        </w:rPr>
+        <w:t>La trazabilidad entre requerimientos, casos y normas sirve para detectar defectos y, al mismo tiempo, para reunir evidencia de cumplimiento frente a la Ley 19.628, la Ley 21.719 y los estándares ISO/IEC y OWASP. Las brechas que encontramos en la ERS quedan documentadas para la siguiente iteración del caso semestral.</w:t>
       </w:r>
     </w:p>
     <w:sectPr>

</xml_diff>

<commit_message>
entregables: informe con figura, tablas numeradas y nuevas secciones
Versión de 27 páginas con la figura de las etapas, leyendas en las tablas, pruebas de aceptación y gestión de defectos.
</commit_message>
<xml_diff>
--- a/entregables/EP1_ISY1102_Informe_Plan_de_Pruebas_Atlas.docx
+++ b/entregables/EP1_ISY1102_Informe_Plan_de_Pruebas_Atlas.docx
@@ -309,7 +309,7 @@
             </w:rPr>
             <w:fldChar w:fldCharType="separate"/>
           </w:r>
-          <w:hyperlink w:anchor="__RefHeading___Toc1928_2151982201">
+          <w:hyperlink w:anchor="__RefHeading___Toc1944_1304436990">
             <w:r>
               <w:rPr>
                 <w:rStyle w:val="IndexLink"/>
@@ -329,7 +329,7 @@
             </w:tabs>
             <w:rPr/>
           </w:pPr>
-          <w:hyperlink w:anchor="__RefHeading___Toc1930_2151982201">
+          <w:hyperlink w:anchor="__RefHeading___Toc1946_1304436990">
             <w:r>
               <w:rPr>
                 <w:rStyle w:val="IndexLink"/>
@@ -349,7 +349,7 @@
             </w:tabs>
             <w:rPr/>
           </w:pPr>
-          <w:hyperlink w:anchor="__RefHeading___Toc1932_2151982201">
+          <w:hyperlink w:anchor="__RefHeading___Toc1948_1304436990">
             <w:r>
               <w:rPr>
                 <w:rStyle w:val="IndexLink"/>
@@ -369,7 +369,7 @@
             </w:tabs>
             <w:rPr/>
           </w:pPr>
-          <w:hyperlink w:anchor="__RefHeading___Toc1934_2151982201">
+          <w:hyperlink w:anchor="__RefHeading___Toc1950_1304436990">
             <w:r>
               <w:rPr>
                 <w:rStyle w:val="IndexLink"/>
@@ -389,7 +389,7 @@
             </w:tabs>
             <w:rPr/>
           </w:pPr>
-          <w:hyperlink w:anchor="__RefHeading___Toc1936_2151982201">
+          <w:hyperlink w:anchor="__RefHeading___Toc1952_1304436990">
             <w:r>
               <w:rPr>
                 <w:rStyle w:val="IndexLink"/>
@@ -409,7 +409,7 @@
             </w:tabs>
             <w:rPr/>
           </w:pPr>
-          <w:hyperlink w:anchor="__RefHeading___Toc1938_2151982201">
+          <w:hyperlink w:anchor="__RefHeading___Toc1954_1304436990">
             <w:r>
               <w:rPr>
                 <w:rStyle w:val="IndexLink"/>
@@ -429,7 +429,7 @@
             </w:tabs>
             <w:rPr/>
           </w:pPr>
-          <w:hyperlink w:anchor="__RefHeading___Toc1940_2151982201">
+          <w:hyperlink w:anchor="__RefHeading___Toc1956_1304436990">
             <w:r>
               <w:rPr>
                 <w:rStyle w:val="IndexLink"/>
@@ -449,7 +449,7 @@
             </w:tabs>
             <w:rPr/>
           </w:pPr>
-          <w:hyperlink w:anchor="__RefHeading___Toc1942_2151982201">
+          <w:hyperlink w:anchor="__RefHeading___Toc1958_1304436990">
             <w:r>
               <w:rPr>
                 <w:rStyle w:val="IndexLink"/>
@@ -469,7 +469,7 @@
             </w:tabs>
             <w:rPr/>
           </w:pPr>
-          <w:hyperlink w:anchor="__RefHeading___Toc1944_2151982201">
+          <w:hyperlink w:anchor="__RefHeading___Toc1960_1304436990">
             <w:r>
               <w:rPr>
                 <w:rStyle w:val="IndexLink"/>
@@ -489,7 +489,7 @@
             </w:tabs>
             <w:rPr/>
           </w:pPr>
-          <w:hyperlink w:anchor="__RefHeading___Toc1946_2151982201">
+          <w:hyperlink w:anchor="__RefHeading___Toc1962_1304436990">
             <w:r>
               <w:rPr>
                 <w:rStyle w:val="IndexLink"/>
@@ -509,14 +509,14 @@
             </w:tabs>
             <w:rPr/>
           </w:pPr>
-          <w:hyperlink w:anchor="__RefHeading___Toc1948_2151982201">
+          <w:hyperlink w:anchor="__RefHeading___Toc1964_1304436990">
             <w:r>
               <w:rPr>
                 <w:rStyle w:val="IndexLink"/>
               </w:rPr>
               <w:t>3. Plan de pruebas</w:t>
               <w:tab/>
-              <w:t>7</w:t>
+              <w:t>8</w:t>
             </w:r>
           </w:hyperlink>
         </w:p>
@@ -529,14 +529,14 @@
             </w:tabs>
             <w:rPr/>
           </w:pPr>
-          <w:hyperlink w:anchor="__RefHeading___Toc1950_2151982201">
+          <w:hyperlink w:anchor="__RefHeading___Toc1966_1304436990">
             <w:r>
               <w:rPr>
                 <w:rStyle w:val="IndexLink"/>
               </w:rPr>
               <w:t>3.1 Estrategia de pruebas</w:t>
               <w:tab/>
-              <w:t>7</w:t>
+              <w:t>8</w:t>
             </w:r>
           </w:hyperlink>
         </w:p>
@@ -549,14 +549,14 @@
             </w:tabs>
             <w:rPr/>
           </w:pPr>
-          <w:hyperlink w:anchor="__RefHeading___Toc1952_2151982201">
+          <w:hyperlink w:anchor="__RefHeading___Toc1968_1304436990">
             <w:r>
               <w:rPr>
                 <w:rStyle w:val="IndexLink"/>
               </w:rPr>
               <w:t>3.2 Tipos de prueba</w:t>
               <w:tab/>
-              <w:t>8</w:t>
+              <w:t>9</w:t>
             </w:r>
           </w:hyperlink>
         </w:p>
@@ -569,14 +569,14 @@
             </w:tabs>
             <w:rPr/>
           </w:pPr>
-          <w:hyperlink w:anchor="__RefHeading___Toc1954_2151982201">
+          <w:hyperlink w:anchor="__RefHeading___Toc1970_1304436990">
             <w:r>
               <w:rPr>
                 <w:rStyle w:val="IndexLink"/>
               </w:rPr>
               <w:t>3.3 Criterios de aceptación</w:t>
               <w:tab/>
-              <w:t>9</w:t>
+              <w:t>10</w:t>
             </w:r>
           </w:hyperlink>
         </w:p>
@@ -589,14 +589,14 @@
             </w:tabs>
             <w:rPr/>
           </w:pPr>
-          <w:hyperlink w:anchor="__RefHeading___Toc1956_2151982201">
+          <w:hyperlink w:anchor="__RefHeading___Toc1972_1304436990">
             <w:r>
               <w:rPr>
                 <w:rStyle w:val="IndexLink"/>
               </w:rPr>
               <w:t>3.4 Herramientas utilizadas</w:t>
               <w:tab/>
-              <w:t>10</w:t>
+              <w:t>11</w:t>
             </w:r>
           </w:hyperlink>
         </w:p>
@@ -609,14 +609,14 @@
             </w:tabs>
             <w:rPr/>
           </w:pPr>
-          <w:hyperlink w:anchor="__RefHeading___Toc1958_2151982201">
+          <w:hyperlink w:anchor="__RefHeading___Toc1974_1304436990">
             <w:r>
               <w:rPr>
                 <w:rStyle w:val="IndexLink"/>
               </w:rPr>
               <w:t>3.5 Recursos y cronograma</w:t>
               <w:tab/>
-              <w:t>10</w:t>
+              <w:t>12</w:t>
             </w:r>
           </w:hyperlink>
         </w:p>
@@ -629,14 +629,14 @@
             </w:tabs>
             <w:rPr/>
           </w:pPr>
-          <w:hyperlink w:anchor="__RefHeading___Toc1960_2151982201">
+          <w:hyperlink w:anchor="__RefHeading___Toc1976_1304436990">
             <w:r>
               <w:rPr>
                 <w:rStyle w:val="IndexLink"/>
               </w:rPr>
               <w:t>4. Diseño de casos de prueba</w:t>
               <w:tab/>
-              <w:t>12</w:t>
+              <w:t>13</w:t>
             </w:r>
           </w:hyperlink>
         </w:p>
@@ -649,14 +649,14 @@
             </w:tabs>
             <w:rPr/>
           </w:pPr>
-          <w:hyperlink w:anchor="__RefHeading___Toc1962_2151982201">
+          <w:hyperlink w:anchor="__RefHeading___Toc1978_1304436990">
             <w:r>
               <w:rPr>
                 <w:rStyle w:val="IndexLink"/>
               </w:rPr>
               <w:t>5. Matriz de trazabilidad y cobertura</w:t>
               <w:tab/>
-              <w:t>21</w:t>
+              <w:t>22</w:t>
             </w:r>
           </w:hyperlink>
         </w:p>
@@ -669,14 +669,14 @@
             </w:tabs>
             <w:rPr/>
           </w:pPr>
-          <w:hyperlink w:anchor="__RefHeading___Toc1964_2151982201">
+          <w:hyperlink w:anchor="__RefHeading___Toc1980_1304436990">
             <w:r>
               <w:rPr>
                 <w:rStyle w:val="IndexLink"/>
               </w:rPr>
               <w:t>5.1 Matriz de trazabilidad</w:t>
               <w:tab/>
-              <w:t>21</w:t>
+              <w:t>22</w:t>
             </w:r>
           </w:hyperlink>
         </w:p>
@@ -689,14 +689,14 @@
             </w:tabs>
             <w:rPr/>
           </w:pPr>
-          <w:hyperlink w:anchor="__RefHeading___Toc1966_2151982201">
+          <w:hyperlink w:anchor="__RefHeading___Toc1982_1304436990">
             <w:r>
               <w:rPr>
                 <w:rStyle w:val="IndexLink"/>
               </w:rPr>
               <w:t>5.2 Cobertura</w:t>
               <w:tab/>
-              <w:t>23</w:t>
+              <w:t>24</w:t>
             </w:r>
           </w:hyperlink>
         </w:p>
@@ -709,14 +709,14 @@
             </w:tabs>
             <w:rPr/>
           </w:pPr>
-          <w:hyperlink w:anchor="__RefHeading___Toc1968_2151982201">
+          <w:hyperlink w:anchor="__RefHeading___Toc1984_1304436990">
             <w:r>
               <w:rPr>
                 <w:rStyle w:val="IndexLink"/>
               </w:rPr>
               <w:t>5.3 Coherencia y brechas</w:t>
               <w:tab/>
-              <w:t>23</w:t>
+              <w:t>24</w:t>
             </w:r>
           </w:hyperlink>
         </w:p>
@@ -729,14 +729,14 @@
             </w:tabs>
             <w:rPr/>
           </w:pPr>
-          <w:hyperlink w:anchor="__RefHeading___Toc1970_2151982201">
+          <w:hyperlink w:anchor="__RefHeading___Toc1986_1304436990">
             <w:r>
               <w:rPr>
                 <w:rStyle w:val="IndexLink"/>
               </w:rPr>
               <w:t>6. Conclusión</w:t>
               <w:tab/>
-              <w:t>25</w:t>
+              <w:t>26</w:t>
             </w:r>
           </w:hyperlink>
         </w:p>
@@ -749,14 +749,14 @@
             </w:tabs>
             <w:rPr/>
           </w:pPr>
-          <w:hyperlink w:anchor="__RefHeading___Toc1972_2151982201">
+          <w:hyperlink w:anchor="__RefHeading___Toc1988_1304436990">
             <w:r>
               <w:rPr>
                 <w:rStyle w:val="IndexLink"/>
               </w:rPr>
               <w:t>Referencias</w:t>
               <w:tab/>
-              <w:t>26</w:t>
+              <w:t>27</w:t>
             </w:r>
           </w:hyperlink>
           <w:r>
@@ -795,7 +795,7 @@
         <w:spacing w:before="0" w:after="180"/>
         <w:rPr/>
       </w:pPr>
-      <w:bookmarkStart w:id="0" w:name="__RefHeading___Toc1928_2151982201"/>
+      <w:bookmarkStart w:id="0" w:name="__RefHeading___Toc1944_1304436990"/>
       <w:bookmarkEnd w:id="0"/>
       <w:r>
         <w:rPr>
@@ -809,7 +809,7 @@
         <w:pStyle w:val="Heading2"/>
         <w:rPr/>
       </w:pPr>
-      <w:bookmarkStart w:id="1" w:name="__RefHeading___Toc1930_2151982201"/>
+      <w:bookmarkStart w:id="1" w:name="__RefHeading___Toc1946_1304436990"/>
       <w:bookmarkEnd w:id="1"/>
       <w:r>
         <w:rPr>
@@ -855,7 +855,7 @@
         <w:pStyle w:val="Heading2"/>
         <w:rPr/>
       </w:pPr>
-      <w:bookmarkStart w:id="2" w:name="__RefHeading___Toc1932_2151982201"/>
+      <w:bookmarkStart w:id="2" w:name="__RefHeading___Toc1948_1304436990"/>
       <w:bookmarkEnd w:id="2"/>
       <w:r>
         <w:rPr>
@@ -1253,6 +1253,25 @@
     <w:p>
       <w:pPr>
         <w:pStyle w:val="Normal"/>
+        <w:spacing w:before="0" w:after="200"/>
+        <w:jc w:val="center"/>
+        <w:rPr/>
+      </w:pPr>
+      <w:r>
+        <w:rPr>
+          <w:rFonts w:eastAsia="Arial" w:cs="Arial"/>
+          <w:i/>
+          <w:iCs/>
+          <w:color w:val="444444"/>
+          <w:sz w:val="17"/>
+          <w:szCs w:val="17"/>
+        </w:rPr>
+        <w:t>Tabla 1. Clasificación de Atlas según calidad, seguridad y cumplimiento.</w:t>
+      </w:r>
+    </w:p>
+    <w:p>
+      <w:pPr>
+        <w:pStyle w:val="Normal"/>
         <w:spacing w:lineRule="exact" w:line="360" w:before="0" w:after="120"/>
         <w:jc w:val="both"/>
         <w:rPr/>
@@ -1271,7 +1290,7 @@
         <w:pStyle w:val="Heading2"/>
         <w:rPr/>
       </w:pPr>
-      <w:bookmarkStart w:id="3" w:name="__RefHeading___Toc1934_2151982201"/>
+      <w:bookmarkStart w:id="3" w:name="__RefHeading___Toc1950_1304436990"/>
       <w:bookmarkEnd w:id="3"/>
       <w:r>
         <w:rPr>
@@ -1401,7 +1420,7 @@
         <w:pStyle w:val="Heading2"/>
         <w:rPr/>
       </w:pPr>
-      <w:bookmarkStart w:id="4" w:name="__RefHeading___Toc1936_2151982201"/>
+      <w:bookmarkStart w:id="4" w:name="__RefHeading___Toc1952_1304436990"/>
       <w:bookmarkEnd w:id="4"/>
       <w:r>
         <w:rPr>
@@ -1460,7 +1479,7 @@
         <w:spacing w:before="0" w:after="180"/>
         <w:rPr/>
       </w:pPr>
-      <w:bookmarkStart w:id="5" w:name="__RefHeading___Toc1938_2151982201"/>
+      <w:bookmarkStart w:id="5" w:name="__RefHeading___Toc1954_1304436990"/>
       <w:bookmarkEnd w:id="5"/>
       <w:r>
         <w:rPr>
@@ -1490,7 +1509,7 @@
         <w:pStyle w:val="Heading2"/>
         <w:rPr/>
       </w:pPr>
-      <w:bookmarkStart w:id="6" w:name="__RefHeading___Toc1940_2151982201"/>
+      <w:bookmarkStart w:id="6" w:name="__RefHeading___Toc1956_1304436990"/>
       <w:bookmarkEnd w:id="6"/>
       <w:r>
         <w:rPr>
@@ -2322,10 +2341,45 @@
     </w:p>
     <w:p>
       <w:pPr>
+        <w:pStyle w:val="Normal"/>
+        <w:spacing w:before="0" w:after="200"/>
+        <w:jc w:val="center"/>
+        <w:rPr/>
+      </w:pPr>
+      <w:r>
+        <w:rPr>
+          <w:rFonts w:eastAsia="Arial" w:cs="Arial"/>
+          <w:i/>
+          <w:iCs/>
+          <w:color w:val="444444"/>
+          <w:sz w:val="17"/>
+          <w:szCs w:val="17"/>
+        </w:rPr>
+        <w:t>Tabla 2. Criterios de calidad del producto según ISO/IEC 25010.</w:t>
+      </w:r>
+    </w:p>
+    <w:p>
+      <w:pPr>
+        <w:pStyle w:val="Normal"/>
+        <w:spacing w:lineRule="exact" w:line="360" w:before="0" w:after="120"/>
+        <w:jc w:val="both"/>
+        <w:rPr/>
+      </w:pPr>
+      <w:r>
+        <w:rPr>
+          <w:rFonts w:eastAsia="Arial" w:cs="Arial"/>
+          <w:sz w:val="22"/>
+          <w:szCs w:val="22"/>
+        </w:rPr>
+        <w:t>La seguridad, que también forma parte del modelo, se desarrolla aparte en 2.2 por su peso en este proyecto. La portabilidad queda con menor detalle porque la ERS no define métricas más allá del diseño responsivo.</w:t>
+      </w:r>
+    </w:p>
+    <w:p>
+      <w:pPr>
         <w:pStyle w:val="Heading2"/>
         <w:rPr/>
       </w:pPr>
-      <w:bookmarkStart w:id="7" w:name="__RefHeading___Toc1942_2151982201"/>
+      <w:bookmarkStart w:id="7" w:name="__RefHeading___Toc1958_1304436990"/>
       <w:bookmarkEnd w:id="7"/>
       <w:r>
         <w:rPr>
@@ -2505,7 +2559,7 @@
         <w:pStyle w:val="Heading2"/>
         <w:rPr/>
       </w:pPr>
-      <w:bookmarkStart w:id="8" w:name="__RefHeading___Toc1944_2151982201"/>
+      <w:bookmarkStart w:id="8" w:name="__RefHeading___Toc1960_1304436990"/>
       <w:bookmarkEnd w:id="8"/>
       <w:r>
         <w:rPr>
@@ -3006,10 +3060,29 @@
     </w:p>
     <w:p>
       <w:pPr>
+        <w:pStyle w:val="Normal"/>
+        <w:spacing w:before="0" w:after="200"/>
+        <w:jc w:val="center"/>
+        <w:rPr/>
+      </w:pPr>
+      <w:r>
+        <w:rPr>
+          <w:rFonts w:eastAsia="Arial" w:cs="Arial"/>
+          <w:i/>
+          <w:iCs/>
+          <w:color w:val="444444"/>
+          <w:sz w:val="17"/>
+          <w:szCs w:val="17"/>
+        </w:rPr>
+        <w:t>Tabla 3. Normas y estándares aplicables al proyecto.</w:t>
+      </w:r>
+    </w:p>
+    <w:p>
+      <w:pPr>
         <w:pStyle w:val="Heading2"/>
         <w:rPr/>
       </w:pPr>
-      <w:bookmarkStart w:id="9" w:name="__RefHeading___Toc1946_2151982201"/>
+      <w:bookmarkStart w:id="9" w:name="__RefHeading___Toc1962_1304436990"/>
       <w:bookmarkEnd w:id="9"/>
       <w:r>
         <w:rPr>
@@ -3172,7 +3245,7 @@
         <w:spacing w:before="0" w:after="180"/>
         <w:rPr/>
       </w:pPr>
-      <w:bookmarkStart w:id="10" w:name="__RefHeading___Toc1948_2151982201"/>
+      <w:bookmarkStart w:id="10" w:name="__RefHeading___Toc1964_1304436990"/>
       <w:bookmarkEnd w:id="10"/>
       <w:r>
         <w:rPr>
@@ -3186,7 +3259,7 @@
         <w:pStyle w:val="Heading2"/>
         <w:rPr/>
       </w:pPr>
-      <w:bookmarkStart w:id="11" w:name="__RefHeading___Toc1950_2151982201"/>
+      <w:bookmarkStart w:id="11" w:name="__RefHeading___Toc1966_1304436990"/>
       <w:bookmarkEnd w:id="11"/>
       <w:r>
         <w:rPr>
@@ -3433,6 +3506,73 @@
           <w:szCs w:val="22"/>
         </w:rPr>
         <w:t xml:space="preserve"> revisión de criterios de salida e informe de resultados.</w:t>
+      </w:r>
+    </w:p>
+    <w:p>
+      <w:pPr>
+        <w:pStyle w:val="Normal"/>
+        <w:spacing w:before="160" w:after="60"/>
+        <w:jc w:val="center"/>
+        <w:rPr/>
+      </w:pPr>
+      <w:r>
+        <w:rPr/>
+        <w:drawing>
+          <wp:inline distT="0" distB="0" distL="0" distR="0">
+            <wp:extent cx="5334000" cy="1504950"/>
+            <wp:effectExtent l="0" t="0" r="0" b="0"/>
+            <wp:docPr id="1" name="Image1" descr=""/>
+            <wp:cNvGraphicFramePr>
+              <a:graphicFrameLocks xmlns:a="http://schemas.openxmlformats.org/drawingml/2006/main" noChangeAspect="1"/>
+            </wp:cNvGraphicFramePr>
+            <a:graphic xmlns:a="http://schemas.openxmlformats.org/drawingml/2006/main">
+              <a:graphicData uri="http://schemas.openxmlformats.org/drawingml/2006/picture">
+                <pic:pic xmlns:pic="http://schemas.openxmlformats.org/drawingml/2006/picture">
+                  <pic:nvPicPr>
+                    <pic:cNvPr id="1" name="Image1" descr=""/>
+                    <pic:cNvPicPr>
+                      <a:picLocks noChangeAspect="1" noChangeArrowheads="1"/>
+                    </pic:cNvPicPr>
+                  </pic:nvPicPr>
+                  <pic:blipFill>
+                    <a:blip r:embed="rId2"/>
+                    <a:stretch>
+                      <a:fillRect/>
+                    </a:stretch>
+                  </pic:blipFill>
+                  <pic:spPr bwMode="auto">
+                    <a:xfrm>
+                      <a:off x="0" y="0"/>
+                      <a:ext cx="5334000" cy="1504950"/>
+                    </a:xfrm>
+                    <a:prstGeom prst="rect">
+                      <a:avLst/>
+                    </a:prstGeom>
+                  </pic:spPr>
+                </pic:pic>
+              </a:graphicData>
+            </a:graphic>
+          </wp:inline>
+        </w:drawing>
+      </w:r>
+    </w:p>
+    <w:p>
+      <w:pPr>
+        <w:pStyle w:val="Normal"/>
+        <w:spacing w:before="0" w:after="200"/>
+        <w:jc w:val="center"/>
+        <w:rPr/>
+      </w:pPr>
+      <w:r>
+        <w:rPr>
+          <w:rFonts w:eastAsia="Arial" w:cs="Arial"/>
+          <w:i/>
+          <w:iCs/>
+          <w:color w:val="444444"/>
+          <w:sz w:val="17"/>
+          <w:szCs w:val="17"/>
+        </w:rPr>
+        <w:t>Figura 1. Etapas del proceso de pruebas y su realimentación.</w:t>
       </w:r>
     </w:p>
     <w:p>
@@ -4084,6 +4224,25 @@
     </w:p>
     <w:p>
       <w:pPr>
+        <w:pStyle w:val="Normal"/>
+        <w:spacing w:before="0" w:after="200"/>
+        <w:jc w:val="center"/>
+        <w:rPr/>
+      </w:pPr>
+      <w:r>
+        <w:rPr>
+          <w:rFonts w:eastAsia="Arial" w:cs="Arial"/>
+          <w:i/>
+          <w:iCs/>
+          <w:color w:val="444444"/>
+          <w:sz w:val="17"/>
+          <w:szCs w:val="17"/>
+        </w:rPr>
+        <w:t>Tabla 4. Priorización de riesgos y requerimientos asociados.</w:t>
+      </w:r>
+    </w:p>
+    <w:p>
+      <w:pPr>
         <w:pStyle w:val="Heading3"/>
         <w:rPr/>
       </w:pPr>
@@ -4247,7 +4406,7 @@
         <w:pStyle w:val="Heading2"/>
         <w:rPr/>
       </w:pPr>
-      <w:bookmarkStart w:id="12" w:name="__RefHeading___Toc1952_2151982201"/>
+      <w:bookmarkStart w:id="12" w:name="__RefHeading___Toc1968_1304436990"/>
       <w:bookmarkEnd w:id="12"/>
       <w:r>
         <w:rPr>
@@ -4459,6 +4618,34 @@
         <w:rPr>
           <w:rFonts w:eastAsia="Arial" w:cs="Arial" w:ascii="Arial" w:hAnsi="Arial"/>
         </w:rPr>
+        <w:t>Pruebas de aceptación</w:t>
+      </w:r>
+    </w:p>
+    <w:p>
+      <w:pPr>
+        <w:pStyle w:val="Normal"/>
+        <w:spacing w:lineRule="exact" w:line="360" w:before="0" w:after="120"/>
+        <w:jc w:val="both"/>
+        <w:rPr/>
+      </w:pPr>
+      <w:r>
+        <w:rPr>
+          <w:rFonts w:eastAsia="Arial" w:cs="Arial"/>
+          <w:sz w:val="22"/>
+          <w:szCs w:val="22"/>
+        </w:rPr>
+        <w:t>Cierran el ciclo. El Product Owner de CreaLab recorre los flujos principales (registro, alta de cliente, contrato con documento y consulta de auditoría) con datos ficticios y confirma que el sistema responde a lo que la empresa necesita. Se ejecutan en preproducción, después de las pruebas de seguridad.</w:t>
+      </w:r>
+    </w:p>
+    <w:p>
+      <w:pPr>
+        <w:pStyle w:val="Heading3"/>
+        <w:rPr/>
+      </w:pPr>
+      <w:r>
+        <w:rPr>
+          <w:rFonts w:eastAsia="Arial" w:cs="Arial" w:ascii="Arial" w:hAnsi="Arial"/>
+        </w:rPr>
         <w:t>Pruebas de compatibilidad</w:t>
       </w:r>
     </w:p>
@@ -4483,7 +4670,7 @@
         <w:pStyle w:val="Heading2"/>
         <w:rPr/>
       </w:pPr>
-      <w:bookmarkStart w:id="13" w:name="__RefHeading___Toc1954_2151982201"/>
+      <w:bookmarkStart w:id="13" w:name="__RefHeading___Toc1970_1304436990"/>
       <w:bookmarkEnd w:id="13"/>
       <w:r>
         <w:rPr>
@@ -4760,10 +4947,26 @@
     </w:p>
     <w:p>
       <w:pPr>
+        <w:pStyle w:val="Normal"/>
+        <w:spacing w:lineRule="exact" w:line="360" w:before="0" w:after="120"/>
+        <w:jc w:val="both"/>
+        <w:rPr/>
+      </w:pPr>
+      <w:r>
+        <w:rPr>
+          <w:rFonts w:eastAsia="Arial" w:cs="Arial"/>
+          <w:sz w:val="22"/>
+          <w:szCs w:val="22"/>
+        </w:rPr>
+        <w:t>Cada defecto se registra en Jira con los pasos para reproducirlo, la evidencia y el requerimiento afectado. El ciclo es: nuevo, asignado, en corrección, listo para verificar y cerrado; si la verificación falla, vuelve a abrirse. Los defectos de seguridad se manejan con visibilidad restringida al equipo, para no exponer detalles del sistema mientras no estén corregidos.</w:t>
+      </w:r>
+    </w:p>
+    <w:p>
+      <w:pPr>
         <w:pStyle w:val="Heading2"/>
         <w:rPr/>
       </w:pPr>
-      <w:bookmarkStart w:id="14" w:name="__RefHeading___Toc1956_2151982201"/>
+      <w:bookmarkStart w:id="14" w:name="__RefHeading___Toc1972_1304436990"/>
       <w:bookmarkEnd w:id="14"/>
       <w:r>
         <w:rPr>
@@ -5549,10 +5752,29 @@
     </w:p>
     <w:p>
       <w:pPr>
+        <w:pStyle w:val="Normal"/>
+        <w:spacing w:before="0" w:after="200"/>
+        <w:jc w:val="center"/>
+        <w:rPr/>
+      </w:pPr>
+      <w:r>
+        <w:rPr>
+          <w:rFonts w:eastAsia="Arial" w:cs="Arial"/>
+          <w:i/>
+          <w:iCs/>
+          <w:color w:val="444444"/>
+          <w:sz w:val="17"/>
+          <w:szCs w:val="17"/>
+        </w:rPr>
+        <w:t>Tabla 5. Herramientas seleccionadas y su uso en el proyecto.</w:t>
+      </w:r>
+    </w:p>
+    <w:p>
+      <w:pPr>
         <w:pStyle w:val="Heading2"/>
         <w:rPr/>
       </w:pPr>
-      <w:bookmarkStart w:id="15" w:name="__RefHeading___Toc1958_2151982201"/>
+      <w:bookmarkStart w:id="15" w:name="__RefHeading___Toc1974_1304436990"/>
       <w:bookmarkEnd w:id="15"/>
       <w:r>
         <w:rPr>
@@ -6267,22 +6489,41 @@
     <w:p>
       <w:pPr>
         <w:pStyle w:val="Normal"/>
-        <w:rPr/>
-      </w:pPr>
-      <w:r>
-        <w:rPr/>
-      </w:r>
-      <w:r>
-        <w:br w:type="page"/>
+        <w:spacing w:before="0" w:after="200"/>
+        <w:jc w:val="center"/>
+        <w:rPr/>
+      </w:pPr>
+      <w:r>
+        <w:rPr>
+          <w:rFonts w:eastAsia="Arial" w:cs="Arial"/>
+          <w:i/>
+          <w:iCs/>
+          <w:color w:val="444444"/>
+          <w:sz w:val="17"/>
+          <w:szCs w:val="17"/>
+        </w:rPr>
+        <w:t>Tabla 6. Cronograma referencial de seis semanas.</w:t>
       </w:r>
     </w:p>
     <w:p>
       <w:pPr>
+        <w:pStyle w:val="Normal"/>
+        <w:rPr/>
+      </w:pPr>
+      <w:r>
+        <w:rPr/>
+      </w:r>
+      <w:r>
+        <w:br w:type="page"/>
+      </w:r>
+    </w:p>
+    <w:p>
+      <w:pPr>
         <w:pStyle w:val="Heading1"/>
         <w:spacing w:before="0" w:after="180"/>
         <w:rPr/>
       </w:pPr>
-      <w:bookmarkStart w:id="16" w:name="__RefHeading___Toc1960_2151982201"/>
+      <w:bookmarkStart w:id="16" w:name="__RefHeading___Toc1976_1304436990"/>
       <w:bookmarkEnd w:id="16"/>
       <w:r>
         <w:rPr>
@@ -13008,7 +13249,7 @@
         <w:spacing w:before="0" w:after="180"/>
         <w:rPr/>
       </w:pPr>
-      <w:bookmarkStart w:id="17" w:name="__RefHeading___Toc1962_2151982201"/>
+      <w:bookmarkStart w:id="17" w:name="__RefHeading___Toc1978_1304436990"/>
       <w:bookmarkEnd w:id="17"/>
       <w:r>
         <w:rPr>
@@ -13022,7 +13263,7 @@
         <w:pStyle w:val="Heading2"/>
         <w:rPr/>
       </w:pPr>
-      <w:bookmarkStart w:id="18" w:name="__RefHeading___Toc1964_2151982201"/>
+      <w:bookmarkStart w:id="18" w:name="__RefHeading___Toc1980_1304436990"/>
       <w:bookmarkEnd w:id="18"/>
       <w:r>
         <w:rPr>
@@ -18900,10 +19141,29 @@
     </w:p>
     <w:p>
       <w:pPr>
+        <w:pStyle w:val="Normal"/>
+        <w:spacing w:before="0" w:after="200"/>
+        <w:jc w:val="center"/>
+        <w:rPr/>
+      </w:pPr>
+      <w:r>
+        <w:rPr>
+          <w:rFonts w:eastAsia="Arial" w:cs="Arial"/>
+          <w:i/>
+          <w:iCs/>
+          <w:color w:val="444444"/>
+          <w:sz w:val="17"/>
+          <w:szCs w:val="17"/>
+        </w:rPr>
+        <w:t>Tabla 7. Matriz de trazabilidad entre requerimientos, casos y normas.</w:t>
+      </w:r>
+    </w:p>
+    <w:p>
+      <w:pPr>
         <w:pStyle w:val="Heading2"/>
         <w:rPr/>
       </w:pPr>
-      <w:bookmarkStart w:id="19" w:name="__RefHeading___Toc1966_2151982201"/>
+      <w:bookmarkStart w:id="19" w:name="__RefHeading___Toc1982_1304436990"/>
       <w:bookmarkEnd w:id="19"/>
       <w:r>
         <w:rPr>
@@ -19954,6 +20214,25 @@
     <w:p>
       <w:pPr>
         <w:pStyle w:val="Normal"/>
+        <w:spacing w:before="0" w:after="200"/>
+        <w:jc w:val="center"/>
+        <w:rPr/>
+      </w:pPr>
+      <w:r>
+        <w:rPr>
+          <w:rFonts w:eastAsia="Arial" w:cs="Arial"/>
+          <w:i/>
+          <w:iCs/>
+          <w:color w:val="444444"/>
+          <w:sz w:val="17"/>
+          <w:szCs w:val="17"/>
+        </w:rPr>
+        <w:t>Tabla 8. Cobertura de requerimientos por grupo.</w:t>
+      </w:r>
+    </w:p>
+    <w:p>
+      <w:pPr>
+        <w:pStyle w:val="Normal"/>
         <w:spacing w:lineRule="exact" w:line="360" w:before="0" w:after="120"/>
         <w:jc w:val="both"/>
         <w:rPr/>
@@ -19972,7 +20251,7 @@
         <w:pStyle w:val="Heading2"/>
         <w:rPr/>
       </w:pPr>
-      <w:bookmarkStart w:id="20" w:name="__RefHeading___Toc1968_2151982201"/>
+      <w:bookmarkStart w:id="20" w:name="__RefHeading___Toc1984_1304436990"/>
       <w:bookmarkEnd w:id="20"/>
       <w:r>
         <w:rPr>
@@ -20091,7 +20370,7 @@
         <w:spacing w:before="0" w:after="180"/>
         <w:rPr/>
       </w:pPr>
-      <w:bookmarkStart w:id="21" w:name="__RefHeading___Toc1970_2151982201"/>
+      <w:bookmarkStart w:id="21" w:name="__RefHeading___Toc1986_1304436990"/>
       <w:bookmarkEnd w:id="21"/>
       <w:r>
         <w:rPr>
@@ -20166,7 +20445,7 @@
         <w:spacing w:before="0" w:after="180"/>
         <w:rPr/>
       </w:pPr>
-      <w:bookmarkStart w:id="22" w:name="__RefHeading___Toc1972_2151982201"/>
+      <w:bookmarkStart w:id="22" w:name="__RefHeading___Toc1988_1304436990"/>
       <w:bookmarkEnd w:id="22"/>
       <w:r>
         <w:rPr>
@@ -20632,12 +20911,12 @@
       </w:r>
     </w:p>
     <w:sectPr>
-      <w:headerReference w:type="even" r:id="rId2"/>
-      <w:headerReference w:type="default" r:id="rId3"/>
-      <w:headerReference w:type="first" r:id="rId4"/>
-      <w:footerReference w:type="even" r:id="rId5"/>
-      <w:footerReference w:type="default" r:id="rId6"/>
-      <w:footerReference w:type="first" r:id="rId7"/>
+      <w:headerReference w:type="even" r:id="rId3"/>
+      <w:headerReference w:type="default" r:id="rId4"/>
+      <w:headerReference w:type="first" r:id="rId5"/>
+      <w:footerReference w:type="even" r:id="rId6"/>
+      <w:footerReference w:type="default" r:id="rId7"/>
+      <w:footerReference w:type="first" r:id="rId8"/>
       <w:type w:val="nextPage"/>
       <w:pgSz w:w="11906" w:h="16838"/>
       <w:pgMar w:left="1440" w:right="1440" w:gutter="0" w:header="708" w:top="1440" w:footer="708" w:bottom="1440"/>
@@ -20687,7 +20966,7 @@
     </w:r>
     <w:r>
       <w:rPr/>
-      <w:t>26</w:t>
+      <w:t>27</w:t>
     </w:r>
     <w:r>
       <w:rPr/>

</xml_diff>

<commit_message>
entregables: informe sin páginas a medias y con pie de página
Los capítulos fluyen sin cortes forzados, el documento baja de 26 a 22 páginas y el pie de página lleva asignatura, proyecto y numeración del total.
</commit_message>
<xml_diff>
--- a/entregables/EP1_ISY1102_Informe_Plan_de_Pruebas_Atlas.docx
+++ b/entregables/EP1_ISY1102_Informe_Plan_de_Pruebas_Atlas.docx
@@ -345,7 +345,7 @@
             </w:rPr>
             <w:fldChar w:fldCharType="separate"/>
           </w:r>
-          <w:hyperlink w:anchor="__RefHeading___Toc1929_1426730147">
+          <w:hyperlink w:anchor="__RefHeading___Toc1936_1549724075">
             <w:r>
               <w:rPr>
                 <w:rStyle w:val="IndexLink"/>
@@ -365,7 +365,7 @@
             </w:tabs>
             <w:rPr/>
           </w:pPr>
-          <w:hyperlink w:anchor="__RefHeading___Toc1931_1426730147">
+          <w:hyperlink w:anchor="__RefHeading___Toc1938_1549724075">
             <w:r>
               <w:rPr>
                 <w:rStyle w:val="IndexLink"/>
@@ -385,7 +385,7 @@
             </w:tabs>
             <w:rPr/>
           </w:pPr>
-          <w:hyperlink w:anchor="__RefHeading___Toc1933_1426730147">
+          <w:hyperlink w:anchor="__RefHeading___Toc1940_1549724075">
             <w:r>
               <w:rPr>
                 <w:rStyle w:val="IndexLink"/>
@@ -405,7 +405,7 @@
             </w:tabs>
             <w:rPr/>
           </w:pPr>
-          <w:hyperlink w:anchor="__RefHeading___Toc1935_1426730147">
+          <w:hyperlink w:anchor="__RefHeading___Toc1942_1549724075">
             <w:r>
               <w:rPr>
                 <w:rStyle w:val="IndexLink"/>
@@ -425,14 +425,14 @@
             </w:tabs>
             <w:rPr/>
           </w:pPr>
-          <w:hyperlink w:anchor="__RefHeading___Toc1937_1426730147">
+          <w:hyperlink w:anchor="__RefHeading___Toc1944_1549724075">
             <w:r>
               <w:rPr>
                 <w:rStyle w:val="IndexLink"/>
               </w:rPr>
               <w:t>2. Criterios de calidad</w:t>
               <w:tab/>
-              <w:t>5</w:t>
+              <w:t>4</w:t>
             </w:r>
           </w:hyperlink>
         </w:p>
@@ -445,14 +445,14 @@
             </w:tabs>
             <w:rPr/>
           </w:pPr>
-          <w:hyperlink w:anchor="__RefHeading___Toc1939_1426730147">
+          <w:hyperlink w:anchor="__RefHeading___Toc1946_1549724075">
             <w:r>
               <w:rPr>
                 <w:rStyle w:val="IndexLink"/>
               </w:rPr>
               <w:t>2.1 Calidad del producto</w:t>
               <w:tab/>
-              <w:t>5</w:t>
+              <w:t>4</w:t>
             </w:r>
           </w:hyperlink>
         </w:p>
@@ -465,7 +465,7 @@
             </w:tabs>
             <w:rPr/>
           </w:pPr>
-          <w:hyperlink w:anchor="__RefHeading___Toc1941_1426730147">
+          <w:hyperlink w:anchor="__RefHeading___Toc1948_1549724075">
             <w:r>
               <w:rPr>
                 <w:rStyle w:val="IndexLink"/>
@@ -485,14 +485,14 @@
             </w:tabs>
             <w:rPr/>
           </w:pPr>
-          <w:hyperlink w:anchor="__RefHeading___Toc1943_1426730147">
+          <w:hyperlink w:anchor="__RefHeading___Toc1950_1549724075">
             <w:r>
               <w:rPr>
                 <w:rStyle w:val="IndexLink"/>
               </w:rPr>
               <w:t>2.3 Normativas</w:t>
               <w:tab/>
-              <w:t>6</w:t>
+              <w:t>5</w:t>
             </w:r>
           </w:hyperlink>
         </w:p>
@@ -505,7 +505,7 @@
             </w:tabs>
             <w:rPr/>
           </w:pPr>
-          <w:hyperlink w:anchor="__RefHeading___Toc1945_1426730147">
+          <w:hyperlink w:anchor="__RefHeading___Toc1952_1549724075">
             <w:r>
               <w:rPr>
                 <w:rStyle w:val="IndexLink"/>
@@ -525,14 +525,14 @@
             </w:tabs>
             <w:rPr/>
           </w:pPr>
-          <w:hyperlink w:anchor="__RefHeading___Toc1947_1426730147">
+          <w:hyperlink w:anchor="__RefHeading___Toc1954_1549724075">
             <w:r>
               <w:rPr>
                 <w:rStyle w:val="IndexLink"/>
               </w:rPr>
               <w:t>3. Plan de pruebas</w:t>
               <w:tab/>
-              <w:t>8</w:t>
+              <w:t>6</w:t>
             </w:r>
           </w:hyperlink>
         </w:p>
@@ -545,14 +545,14 @@
             </w:tabs>
             <w:rPr/>
           </w:pPr>
-          <w:hyperlink w:anchor="__RefHeading___Toc1949_1426730147">
+          <w:hyperlink w:anchor="__RefHeading___Toc1956_1549724075">
             <w:r>
               <w:rPr>
                 <w:rStyle w:val="IndexLink"/>
               </w:rPr>
               <w:t>3.1 Estrategia de pruebas</w:t>
               <w:tab/>
-              <w:t>8</w:t>
+              <w:t>6</w:t>
             </w:r>
           </w:hyperlink>
         </w:p>
@@ -565,14 +565,14 @@
             </w:tabs>
             <w:rPr/>
           </w:pPr>
-          <w:hyperlink w:anchor="__RefHeading___Toc1951_1426730147">
+          <w:hyperlink w:anchor="__RefHeading___Toc1958_1549724075">
             <w:r>
               <w:rPr>
                 <w:rStyle w:val="IndexLink"/>
               </w:rPr>
               <w:t>3.2 Tipos de prueba</w:t>
               <w:tab/>
-              <w:t>9</w:t>
+              <w:t>8</w:t>
             </w:r>
           </w:hyperlink>
         </w:p>
@@ -585,14 +585,14 @@
             </w:tabs>
             <w:rPr/>
           </w:pPr>
-          <w:hyperlink w:anchor="__RefHeading___Toc1953_1426730147">
+          <w:hyperlink w:anchor="__RefHeading___Toc1960_1549724075">
             <w:r>
               <w:rPr>
                 <w:rStyle w:val="IndexLink"/>
               </w:rPr>
               <w:t>3.3 Criterios de aceptación</w:t>
               <w:tab/>
-              <w:t>10</w:t>
+              <w:t>8</w:t>
             </w:r>
           </w:hyperlink>
         </w:p>
@@ -605,14 +605,14 @@
             </w:tabs>
             <w:rPr/>
           </w:pPr>
-          <w:hyperlink w:anchor="__RefHeading___Toc1955_1426730147">
+          <w:hyperlink w:anchor="__RefHeading___Toc1962_1549724075">
             <w:r>
               <w:rPr>
                 <w:rStyle w:val="IndexLink"/>
               </w:rPr>
               <w:t>3.4 Herramientas utilizadas</w:t>
               <w:tab/>
-              <w:t>11</w:t>
+              <w:t>9</w:t>
             </w:r>
           </w:hyperlink>
         </w:p>
@@ -625,14 +625,14 @@
             </w:tabs>
             <w:rPr/>
           </w:pPr>
-          <w:hyperlink w:anchor="__RefHeading___Toc1957_1426730147">
+          <w:hyperlink w:anchor="__RefHeading___Toc1964_1549724075">
             <w:r>
               <w:rPr>
                 <w:rStyle w:val="IndexLink"/>
               </w:rPr>
               <w:t>3.5 Recursos y cronograma</w:t>
               <w:tab/>
-              <w:t>11</w:t>
+              <w:t>10</w:t>
             </w:r>
           </w:hyperlink>
         </w:p>
@@ -645,14 +645,14 @@
             </w:tabs>
             <w:rPr/>
           </w:pPr>
-          <w:hyperlink w:anchor="__RefHeading___Toc1959_1426730147">
+          <w:hyperlink w:anchor="__RefHeading___Toc1966_1549724075">
             <w:r>
               <w:rPr>
                 <w:rStyle w:val="IndexLink"/>
               </w:rPr>
               <w:t>4. Diseño de casos de prueba</w:t>
               <w:tab/>
-              <w:t>13</w:t>
+              <w:t>11</w:t>
             </w:r>
           </w:hyperlink>
         </w:p>
@@ -665,14 +665,14 @@
             </w:tabs>
             <w:rPr/>
           </w:pPr>
-          <w:hyperlink w:anchor="__RefHeading___Toc1961_1426730147">
+          <w:hyperlink w:anchor="__RefHeading___Toc1968_1549724075">
             <w:r>
               <w:rPr>
                 <w:rStyle w:val="IndexLink"/>
               </w:rPr>
               <w:t>5. Cobertura y coherencia</w:t>
               <w:tab/>
-              <w:t>20</w:t>
+              <w:t>17</w:t>
             </w:r>
           </w:hyperlink>
         </w:p>
@@ -685,14 +685,14 @@
             </w:tabs>
             <w:rPr/>
           </w:pPr>
-          <w:hyperlink w:anchor="__RefHeading___Toc1963_1426730147">
+          <w:hyperlink w:anchor="__RefHeading___Toc1970_1549724075">
             <w:r>
               <w:rPr>
                 <w:rStyle w:val="IndexLink"/>
               </w:rPr>
               <w:t>5.1 Cobertura de requerimientos</w:t>
               <w:tab/>
-              <w:t>20</w:t>
+              <w:t>17</w:t>
             </w:r>
           </w:hyperlink>
         </w:p>
@@ -705,14 +705,14 @@
             </w:tabs>
             <w:rPr/>
           </w:pPr>
-          <w:hyperlink w:anchor="__RefHeading___Toc1965_1426730147">
+          <w:hyperlink w:anchor="__RefHeading___Toc1972_1549724075">
             <w:r>
               <w:rPr>
                 <w:rStyle w:val="IndexLink"/>
               </w:rPr>
               <w:t>5.2 Coherencia del plan</w:t>
               <w:tab/>
-              <w:t>20</w:t>
+              <w:t>18</w:t>
             </w:r>
           </w:hyperlink>
         </w:p>
@@ -725,14 +725,14 @@
             </w:tabs>
             <w:rPr/>
           </w:pPr>
-          <w:hyperlink w:anchor="__RefHeading___Toc1967_1426730147">
+          <w:hyperlink w:anchor="__RefHeading___Toc1974_1549724075">
             <w:r>
               <w:rPr>
                 <w:rStyle w:val="IndexLink"/>
               </w:rPr>
               <w:t>5.3 Brechas para la iteración 2</w:t>
               <w:tab/>
-              <w:t>21</w:t>
+              <w:t>18</w:t>
             </w:r>
           </w:hyperlink>
         </w:p>
@@ -745,14 +745,14 @@
             </w:tabs>
             <w:rPr/>
           </w:pPr>
-          <w:hyperlink w:anchor="__RefHeading___Toc1969_1426730147">
+          <w:hyperlink w:anchor="__RefHeading___Toc1976_1549724075">
             <w:r>
               <w:rPr>
                 <w:rStyle w:val="IndexLink"/>
               </w:rPr>
               <w:t>6. Conclusión</w:t>
               <w:tab/>
-              <w:t>22</w:t>
+              <w:t>18</w:t>
             </w:r>
           </w:hyperlink>
         </w:p>
@@ -765,14 +765,14 @@
             </w:tabs>
             <w:rPr/>
           </w:pPr>
-          <w:hyperlink w:anchor="__RefHeading___Toc1971_1426730147">
+          <w:hyperlink w:anchor="__RefHeading___Toc1978_1549724075">
             <w:r>
               <w:rPr>
                 <w:rStyle w:val="IndexLink"/>
               </w:rPr>
               <w:t>Referencias</w:t>
               <w:tab/>
-              <w:t>23</w:t>
+              <w:t>19</w:t>
             </w:r>
           </w:hyperlink>
         </w:p>
@@ -785,14 +785,14 @@
             </w:tabs>
             <w:rPr/>
           </w:pPr>
-          <w:hyperlink w:anchor="__RefHeading___Toc1973_1426730147">
+          <w:hyperlink w:anchor="__RefHeading___Toc1980_1549724075">
             <w:r>
               <w:rPr>
                 <w:rStyle w:val="IndexLink"/>
               </w:rPr>
               <w:t>Anexo A. Matriz de trazabilidad</w:t>
               <w:tab/>
-              <w:t>24</w:t>
+              <w:t>20</w:t>
             </w:r>
           </w:hyperlink>
           <w:r>
@@ -831,7 +831,7 @@
         <w:spacing w:before="0" w:after="200"/>
         <w:rPr/>
       </w:pPr>
-      <w:bookmarkStart w:id="0" w:name="__RefHeading___Toc1929_1426730147"/>
+      <w:bookmarkStart w:id="0" w:name="__RefHeading___Toc1936_1549724075"/>
       <w:bookmarkEnd w:id="0"/>
       <w:r>
         <w:rPr>
@@ -845,7 +845,7 @@
         <w:pStyle w:val="Heading2"/>
         <w:rPr/>
       </w:pPr>
-      <w:bookmarkStart w:id="1" w:name="__RefHeading___Toc1931_1426730147"/>
+      <w:bookmarkStart w:id="1" w:name="__RefHeading___Toc1938_1549724075"/>
       <w:bookmarkEnd w:id="1"/>
       <w:r>
         <w:rPr>
@@ -891,7 +891,7 @@
         <w:pStyle w:val="Heading2"/>
         <w:rPr/>
       </w:pPr>
-      <w:bookmarkStart w:id="2" w:name="__RefHeading___Toc1933_1426730147"/>
+      <w:bookmarkStart w:id="2" w:name="__RefHeading___Toc1940_1549724075"/>
       <w:bookmarkEnd w:id="2"/>
       <w:r>
         <w:rPr>
@@ -1332,7 +1332,7 @@
         <w:pStyle w:val="Heading2"/>
         <w:rPr/>
       </w:pPr>
-      <w:bookmarkStart w:id="3" w:name="__RefHeading___Toc1935_1426730147"/>
+      <w:bookmarkStart w:id="3" w:name="__RefHeading___Toc1942_1549724075"/>
       <w:bookmarkEnd w:id="3"/>
       <w:r>
         <w:rPr>
@@ -1375,23 +1375,10 @@
     </w:p>
     <w:p>
       <w:pPr>
-        <w:pStyle w:val="Normal"/>
+        <w:pStyle w:val="Heading1"/>
         <w:rPr/>
       </w:pPr>
-      <w:r>
-        <w:rPr/>
-      </w:r>
-      <w:r>
-        <w:br w:type="page"/>
-      </w:r>
-    </w:p>
-    <w:p>
-      <w:pPr>
-        <w:pStyle w:val="Heading1"/>
-        <w:spacing w:before="0" w:after="200"/>
-        <w:rPr/>
-      </w:pPr>
-      <w:bookmarkStart w:id="4" w:name="__RefHeading___Toc1937_1426730147"/>
+      <w:bookmarkStart w:id="4" w:name="__RefHeading___Toc1944_1549724075"/>
       <w:bookmarkEnd w:id="4"/>
       <w:r>
         <w:rPr>
@@ -1421,7 +1408,7 @@
         <w:pStyle w:val="Heading2"/>
         <w:rPr/>
       </w:pPr>
-      <w:bookmarkStart w:id="5" w:name="__RefHeading___Toc1939_1426730147"/>
+      <w:bookmarkStart w:id="5" w:name="__RefHeading___Toc1946_1549724075"/>
       <w:bookmarkEnd w:id="5"/>
       <w:r>
         <w:rPr>
@@ -2307,7 +2294,7 @@
         <w:pStyle w:val="Heading2"/>
         <w:rPr/>
       </w:pPr>
-      <w:bookmarkStart w:id="6" w:name="__RefHeading___Toc1941_1426730147"/>
+      <w:bookmarkStart w:id="6" w:name="__RefHeading___Toc1948_1549724075"/>
       <w:bookmarkEnd w:id="6"/>
       <w:r>
         <w:rPr>
@@ -2517,7 +2504,7 @@
         <w:pStyle w:val="Heading2"/>
         <w:rPr/>
       </w:pPr>
-      <w:bookmarkStart w:id="7" w:name="__RefHeading___Toc1943_1426730147"/>
+      <w:bookmarkStart w:id="7" w:name="__RefHeading___Toc1950_1549724075"/>
       <w:bookmarkEnd w:id="7"/>
       <w:r>
         <w:rPr>
@@ -3048,7 +3035,7 @@
         <w:pStyle w:val="Heading2"/>
         <w:rPr/>
       </w:pPr>
-      <w:bookmarkStart w:id="8" w:name="__RefHeading___Toc1945_1426730147"/>
+      <w:bookmarkStart w:id="8" w:name="__RefHeading___Toc1952_1549724075"/>
       <w:bookmarkEnd w:id="8"/>
       <w:r>
         <w:rPr>
@@ -3195,23 +3182,10 @@
     </w:p>
     <w:p>
       <w:pPr>
-        <w:pStyle w:val="Normal"/>
+        <w:pStyle w:val="Heading1"/>
         <w:rPr/>
       </w:pPr>
-      <w:r>
-        <w:rPr/>
-      </w:r>
-      <w:r>
-        <w:br w:type="page"/>
-      </w:r>
-    </w:p>
-    <w:p>
-      <w:pPr>
-        <w:pStyle w:val="Heading1"/>
-        <w:spacing w:before="0" w:after="200"/>
-        <w:rPr/>
-      </w:pPr>
-      <w:bookmarkStart w:id="9" w:name="__RefHeading___Toc1947_1426730147"/>
+      <w:bookmarkStart w:id="9" w:name="__RefHeading___Toc1954_1549724075"/>
       <w:bookmarkEnd w:id="9"/>
       <w:r>
         <w:rPr>
@@ -3225,7 +3199,7 @@
         <w:pStyle w:val="Heading2"/>
         <w:rPr/>
       </w:pPr>
-      <w:bookmarkStart w:id="10" w:name="__RefHeading___Toc1949_1426730147"/>
+      <w:bookmarkStart w:id="10" w:name="__RefHeading___Toc1956_1549724075"/>
       <w:bookmarkEnd w:id="10"/>
       <w:r>
         <w:rPr>
@@ -4284,7 +4258,7 @@
         <w:pStyle w:val="Heading2"/>
         <w:rPr/>
       </w:pPr>
-      <w:bookmarkStart w:id="11" w:name="__RefHeading___Toc1951_1426730147"/>
+      <w:bookmarkStart w:id="11" w:name="__RefHeading___Toc1958_1549724075"/>
       <w:bookmarkEnd w:id="11"/>
       <w:r>
         <w:rPr>
@@ -4480,7 +4454,7 @@
         <w:pStyle w:val="Heading2"/>
         <w:rPr/>
       </w:pPr>
-      <w:bookmarkStart w:id="12" w:name="__RefHeading___Toc1953_1426730147"/>
+      <w:bookmarkStart w:id="12" w:name="__RefHeading___Toc1960_1549724075"/>
       <w:bookmarkEnd w:id="12"/>
       <w:r>
         <w:rPr>
@@ -4616,7 +4590,7 @@
         <w:pStyle w:val="Heading2"/>
         <w:rPr/>
       </w:pPr>
-      <w:bookmarkStart w:id="13" w:name="__RefHeading___Toc1955_1426730147"/>
+      <w:bookmarkStart w:id="13" w:name="__RefHeading___Toc1962_1549724075"/>
       <w:bookmarkEnd w:id="13"/>
       <w:r>
         <w:rPr>
@@ -5438,7 +5412,7 @@
         <w:pStyle w:val="Heading2"/>
         <w:rPr/>
       </w:pPr>
-      <w:bookmarkStart w:id="14" w:name="__RefHeading___Toc1957_1426730147"/>
+      <w:bookmarkStart w:id="14" w:name="__RefHeading___Toc1964_1549724075"/>
       <w:bookmarkEnd w:id="14"/>
       <w:r>
         <w:rPr>
@@ -6193,7 +6167,7 @@
         <w:spacing w:before="0" w:after="200"/>
         <w:rPr/>
       </w:pPr>
-      <w:bookmarkStart w:id="15" w:name="__RefHeading___Toc1959_1426730147"/>
+      <w:bookmarkStart w:id="15" w:name="__RefHeading___Toc1966_1549724075"/>
       <w:bookmarkEnd w:id="15"/>
       <w:r>
         <w:rPr>
@@ -12844,23 +12818,10 @@
     </w:p>
     <w:p>
       <w:pPr>
-        <w:pStyle w:val="Normal"/>
+        <w:pStyle w:val="Heading1"/>
         <w:rPr/>
       </w:pPr>
-      <w:r>
-        <w:rPr/>
-      </w:r>
-      <w:r>
-        <w:br w:type="page"/>
-      </w:r>
-    </w:p>
-    <w:p>
-      <w:pPr>
-        <w:pStyle w:val="Heading1"/>
-        <w:spacing w:before="0" w:after="200"/>
-        <w:rPr/>
-      </w:pPr>
-      <w:bookmarkStart w:id="16" w:name="__RefHeading___Toc1961_1426730147"/>
+      <w:bookmarkStart w:id="16" w:name="__RefHeading___Toc1968_1549724075"/>
       <w:bookmarkEnd w:id="16"/>
       <w:r>
         <w:rPr>
@@ -12874,7 +12835,7 @@
         <w:pStyle w:val="Heading2"/>
         <w:rPr/>
       </w:pPr>
-      <w:bookmarkStart w:id="17" w:name="__RefHeading___Toc1963_1426730147"/>
+      <w:bookmarkStart w:id="17" w:name="__RefHeading___Toc1970_1549724075"/>
       <w:bookmarkEnd w:id="17"/>
       <w:r>
         <w:rPr>
@@ -13982,7 +13943,7 @@
         <w:pStyle w:val="Heading2"/>
         <w:rPr/>
       </w:pPr>
-      <w:bookmarkStart w:id="18" w:name="__RefHeading___Toc1965_1426730147"/>
+      <w:bookmarkStart w:id="18" w:name="__RefHeading___Toc1972_1549724075"/>
       <w:bookmarkEnd w:id="18"/>
       <w:r>
         <w:rPr>
@@ -14028,7 +13989,7 @@
         <w:pStyle w:val="Heading2"/>
         <w:rPr/>
       </w:pPr>
-      <w:bookmarkStart w:id="19" w:name="__RefHeading___Toc1967_1426730147"/>
+      <w:bookmarkStart w:id="19" w:name="__RefHeading___Toc1974_1549724075"/>
       <w:bookmarkEnd w:id="19"/>
       <w:r>
         <w:rPr>
@@ -14099,23 +14060,10 @@
     </w:p>
     <w:p>
       <w:pPr>
-        <w:pStyle w:val="Normal"/>
+        <w:pStyle w:val="Heading1"/>
         <w:rPr/>
       </w:pPr>
-      <w:r>
-        <w:rPr/>
-      </w:r>
-      <w:r>
-        <w:br w:type="page"/>
-      </w:r>
-    </w:p>
-    <w:p>
-      <w:pPr>
-        <w:pStyle w:val="Heading1"/>
-        <w:spacing w:before="0" w:after="200"/>
-        <w:rPr/>
-      </w:pPr>
-      <w:bookmarkStart w:id="20" w:name="__RefHeading___Toc1969_1426730147"/>
+      <w:bookmarkStart w:id="20" w:name="__RefHeading___Toc1976_1549724075"/>
       <w:bookmarkEnd w:id="20"/>
       <w:r>
         <w:rPr>
@@ -14174,23 +14122,10 @@
     </w:p>
     <w:p>
       <w:pPr>
-        <w:pStyle w:val="Normal"/>
+        <w:pStyle w:val="Heading1"/>
         <w:rPr/>
       </w:pPr>
-      <w:r>
-        <w:rPr/>
-      </w:r>
-      <w:r>
-        <w:br w:type="page"/>
-      </w:r>
-    </w:p>
-    <w:p>
-      <w:pPr>
-        <w:pStyle w:val="Heading1"/>
-        <w:spacing w:before="0" w:after="200"/>
-        <w:rPr/>
-      </w:pPr>
-      <w:bookmarkStart w:id="21" w:name="__RefHeading___Toc1971_1426730147"/>
+      <w:bookmarkStart w:id="21" w:name="__RefHeading___Toc1978_1549724075"/>
       <w:bookmarkEnd w:id="21"/>
       <w:r>
         <w:rPr>
@@ -14673,7 +14608,7 @@
         <w:spacing w:before="0" w:after="200"/>
         <w:rPr/>
       </w:pPr>
-      <w:bookmarkStart w:id="22" w:name="__RefHeading___Toc1973_1426730147"/>
+      <w:bookmarkStart w:id="22" w:name="__RefHeading___Toc1980_1549724075"/>
       <w:bookmarkEnd w:id="22"/>
       <w:r>
         <w:rPr>
@@ -20714,9 +20649,42 @@
   <w:p>
     <w:pPr>
       <w:pStyle w:val="Normal"/>
-      <w:jc w:val="center"/>
+      <w:pBdr>
+        <w:top w:val="single" w:sz="6" w:space="6" w:color="D6D9E0"/>
+      </w:pBdr>
+      <w:tabs>
+        <w:tab w:val="clear" w:pos="720"/>
+        <w:tab w:val="right" w:pos="9026" w:leader="none"/>
+      </w:tabs>
+      <w:spacing w:before="80" w:after="0"/>
       <w:rPr/>
     </w:pPr>
+    <w:r>
+      <w:rPr>
+        <w:rFonts w:eastAsia="Arial" w:cs="Arial"/>
+        <w:color w:val="7A8699"/>
+        <w:sz w:val="15"/>
+        <w:szCs w:val="15"/>
+      </w:rPr>
+      <w:t>ISY1102 · Plan de pruebas · Sistema de Gestión Atlas</w:t>
+    </w:r>
+    <w:r>
+      <w:rPr>
+        <w:rFonts w:eastAsia="Arial" w:cs="Arial"/>
+        <w:sz w:val="15"/>
+        <w:szCs w:val="15"/>
+      </w:rPr>
+      <w:tab/>
+    </w:r>
+    <w:r>
+      <w:rPr>
+        <w:rFonts w:eastAsia="Arial" w:cs="Arial"/>
+        <w:color w:val="7A8699"/>
+        <w:sz w:val="15"/>
+        <w:szCs w:val="15"/>
+      </w:rPr>
+      <w:t xml:space="preserve">Página </w:t>
+    </w:r>
     <w:r>
       <w:rPr/>
       <w:fldChar w:fldCharType="begin"/>
@@ -20731,7 +20699,36 @@
     </w:r>
     <w:r>
       <w:rPr/>
-      <w:t>26</w:t>
+      <w:t>22</w:t>
+    </w:r>
+    <w:r>
+      <w:rPr/>
+      <w:fldChar w:fldCharType="end"/>
+    </w:r>
+    <w:r>
+      <w:rPr>
+        <w:rFonts w:eastAsia="Arial" w:cs="Arial"/>
+        <w:color w:val="7A8699"/>
+        <w:sz w:val="15"/>
+        <w:szCs w:val="15"/>
+      </w:rPr>
+      <w:t xml:space="preserve"> de </w:t>
+    </w:r>
+    <w:r>
+      <w:rPr/>
+      <w:fldChar w:fldCharType="begin"/>
+    </w:r>
+    <w:r>
+      <w:rPr/>
+      <w:instrText xml:space="preserve"> NUMPAGES </w:instrText>
+    </w:r>
+    <w:r>
+      <w:rPr/>
+      <w:fldChar w:fldCharType="separate"/>
+    </w:r>
+    <w:r>
+      <w:rPr/>
+      <w:t>22</w:t>
     </w:r>
     <w:r>
       <w:rPr/>

</xml_diff>

<commit_message>
entregables: completa las propiedades del documento
Título, autor, asignatura y palabras clave quedan registrados en el Word y en el PDF, y el idioma del documento pasa a español de Chile.
</commit_message>
<xml_diff>
--- a/entregables/EP1_ISY1102_Informe_Plan_de_Pruebas_Atlas.docx
+++ b/entregables/EP1_ISY1102_Informe_Plan_de_Pruebas_Atlas.docx
@@ -345,7 +345,7 @@
             </w:rPr>
             <w:fldChar w:fldCharType="separate"/>
           </w:r>
-          <w:hyperlink w:anchor="__RefHeading___Toc1936_1549724075">
+          <w:hyperlink w:anchor="__RefHeading___Toc1936_2251457349">
             <w:r>
               <w:rPr>
                 <w:rStyle w:val="IndexLink"/>
@@ -365,7 +365,7 @@
             </w:tabs>
             <w:rPr/>
           </w:pPr>
-          <w:hyperlink w:anchor="__RefHeading___Toc1938_1549724075">
+          <w:hyperlink w:anchor="__RefHeading___Toc1938_2251457349">
             <w:r>
               <w:rPr>
                 <w:rStyle w:val="IndexLink"/>
@@ -385,7 +385,7 @@
             </w:tabs>
             <w:rPr/>
           </w:pPr>
-          <w:hyperlink w:anchor="__RefHeading___Toc1940_1549724075">
+          <w:hyperlink w:anchor="__RefHeading___Toc1940_2251457349">
             <w:r>
               <w:rPr>
                 <w:rStyle w:val="IndexLink"/>
@@ -405,7 +405,7 @@
             </w:tabs>
             <w:rPr/>
           </w:pPr>
-          <w:hyperlink w:anchor="__RefHeading___Toc1942_1549724075">
+          <w:hyperlink w:anchor="__RefHeading___Toc1942_2251457349">
             <w:r>
               <w:rPr>
                 <w:rStyle w:val="IndexLink"/>
@@ -425,7 +425,7 @@
             </w:tabs>
             <w:rPr/>
           </w:pPr>
-          <w:hyperlink w:anchor="__RefHeading___Toc1944_1549724075">
+          <w:hyperlink w:anchor="__RefHeading___Toc1944_2251457349">
             <w:r>
               <w:rPr>
                 <w:rStyle w:val="IndexLink"/>
@@ -445,7 +445,7 @@
             </w:tabs>
             <w:rPr/>
           </w:pPr>
-          <w:hyperlink w:anchor="__RefHeading___Toc1946_1549724075">
+          <w:hyperlink w:anchor="__RefHeading___Toc1946_2251457349">
             <w:r>
               <w:rPr>
                 <w:rStyle w:val="IndexLink"/>
@@ -465,7 +465,7 @@
             </w:tabs>
             <w:rPr/>
           </w:pPr>
-          <w:hyperlink w:anchor="__RefHeading___Toc1948_1549724075">
+          <w:hyperlink w:anchor="__RefHeading___Toc1948_2251457349">
             <w:r>
               <w:rPr>
                 <w:rStyle w:val="IndexLink"/>
@@ -485,7 +485,7 @@
             </w:tabs>
             <w:rPr/>
           </w:pPr>
-          <w:hyperlink w:anchor="__RefHeading___Toc1950_1549724075">
+          <w:hyperlink w:anchor="__RefHeading___Toc1950_2251457349">
             <w:r>
               <w:rPr>
                 <w:rStyle w:val="IndexLink"/>
@@ -505,7 +505,7 @@
             </w:tabs>
             <w:rPr/>
           </w:pPr>
-          <w:hyperlink w:anchor="__RefHeading___Toc1952_1549724075">
+          <w:hyperlink w:anchor="__RefHeading___Toc1952_2251457349">
             <w:r>
               <w:rPr>
                 <w:rStyle w:val="IndexLink"/>
@@ -525,7 +525,7 @@
             </w:tabs>
             <w:rPr/>
           </w:pPr>
-          <w:hyperlink w:anchor="__RefHeading___Toc1954_1549724075">
+          <w:hyperlink w:anchor="__RefHeading___Toc1954_2251457349">
             <w:r>
               <w:rPr>
                 <w:rStyle w:val="IndexLink"/>
@@ -545,7 +545,7 @@
             </w:tabs>
             <w:rPr/>
           </w:pPr>
-          <w:hyperlink w:anchor="__RefHeading___Toc1956_1549724075">
+          <w:hyperlink w:anchor="__RefHeading___Toc1956_2251457349">
             <w:r>
               <w:rPr>
                 <w:rStyle w:val="IndexLink"/>
@@ -565,7 +565,7 @@
             </w:tabs>
             <w:rPr/>
           </w:pPr>
-          <w:hyperlink w:anchor="__RefHeading___Toc1958_1549724075">
+          <w:hyperlink w:anchor="__RefHeading___Toc1958_2251457349">
             <w:r>
               <w:rPr>
                 <w:rStyle w:val="IndexLink"/>
@@ -585,7 +585,7 @@
             </w:tabs>
             <w:rPr/>
           </w:pPr>
-          <w:hyperlink w:anchor="__RefHeading___Toc1960_1549724075">
+          <w:hyperlink w:anchor="__RefHeading___Toc1960_2251457349">
             <w:r>
               <w:rPr>
                 <w:rStyle w:val="IndexLink"/>
@@ -605,7 +605,7 @@
             </w:tabs>
             <w:rPr/>
           </w:pPr>
-          <w:hyperlink w:anchor="__RefHeading___Toc1962_1549724075">
+          <w:hyperlink w:anchor="__RefHeading___Toc1962_2251457349">
             <w:r>
               <w:rPr>
                 <w:rStyle w:val="IndexLink"/>
@@ -625,7 +625,7 @@
             </w:tabs>
             <w:rPr/>
           </w:pPr>
-          <w:hyperlink w:anchor="__RefHeading___Toc1964_1549724075">
+          <w:hyperlink w:anchor="__RefHeading___Toc1964_2251457349">
             <w:r>
               <w:rPr>
                 <w:rStyle w:val="IndexLink"/>
@@ -645,7 +645,7 @@
             </w:tabs>
             <w:rPr/>
           </w:pPr>
-          <w:hyperlink w:anchor="__RefHeading___Toc1966_1549724075">
+          <w:hyperlink w:anchor="__RefHeading___Toc1966_2251457349">
             <w:r>
               <w:rPr>
                 <w:rStyle w:val="IndexLink"/>
@@ -665,7 +665,7 @@
             </w:tabs>
             <w:rPr/>
           </w:pPr>
-          <w:hyperlink w:anchor="__RefHeading___Toc1968_1549724075">
+          <w:hyperlink w:anchor="__RefHeading___Toc1968_2251457349">
             <w:r>
               <w:rPr>
                 <w:rStyle w:val="IndexLink"/>
@@ -685,7 +685,7 @@
             </w:tabs>
             <w:rPr/>
           </w:pPr>
-          <w:hyperlink w:anchor="__RefHeading___Toc1970_1549724075">
+          <w:hyperlink w:anchor="__RefHeading___Toc1970_2251457349">
             <w:r>
               <w:rPr>
                 <w:rStyle w:val="IndexLink"/>
@@ -705,7 +705,7 @@
             </w:tabs>
             <w:rPr/>
           </w:pPr>
-          <w:hyperlink w:anchor="__RefHeading___Toc1972_1549724075">
+          <w:hyperlink w:anchor="__RefHeading___Toc1972_2251457349">
             <w:r>
               <w:rPr>
                 <w:rStyle w:val="IndexLink"/>
@@ -725,7 +725,7 @@
             </w:tabs>
             <w:rPr/>
           </w:pPr>
-          <w:hyperlink w:anchor="__RefHeading___Toc1974_1549724075">
+          <w:hyperlink w:anchor="__RefHeading___Toc1974_2251457349">
             <w:r>
               <w:rPr>
                 <w:rStyle w:val="IndexLink"/>
@@ -745,7 +745,7 @@
             </w:tabs>
             <w:rPr/>
           </w:pPr>
-          <w:hyperlink w:anchor="__RefHeading___Toc1976_1549724075">
+          <w:hyperlink w:anchor="__RefHeading___Toc1976_2251457349">
             <w:r>
               <w:rPr>
                 <w:rStyle w:val="IndexLink"/>
@@ -765,7 +765,7 @@
             </w:tabs>
             <w:rPr/>
           </w:pPr>
-          <w:hyperlink w:anchor="__RefHeading___Toc1978_1549724075">
+          <w:hyperlink w:anchor="__RefHeading___Toc1978_2251457349">
             <w:r>
               <w:rPr>
                 <w:rStyle w:val="IndexLink"/>
@@ -785,7 +785,7 @@
             </w:tabs>
             <w:rPr/>
           </w:pPr>
-          <w:hyperlink w:anchor="__RefHeading___Toc1980_1549724075">
+          <w:hyperlink w:anchor="__RefHeading___Toc1980_2251457349">
             <w:r>
               <w:rPr>
                 <w:rStyle w:val="IndexLink"/>
@@ -831,7 +831,7 @@
         <w:spacing w:before="0" w:after="200"/>
         <w:rPr/>
       </w:pPr>
-      <w:bookmarkStart w:id="0" w:name="__RefHeading___Toc1936_1549724075"/>
+      <w:bookmarkStart w:id="0" w:name="__RefHeading___Toc1936_2251457349"/>
       <w:bookmarkEnd w:id="0"/>
       <w:r>
         <w:rPr>
@@ -845,7 +845,7 @@
         <w:pStyle w:val="Heading2"/>
         <w:rPr/>
       </w:pPr>
-      <w:bookmarkStart w:id="1" w:name="__RefHeading___Toc1938_1549724075"/>
+      <w:bookmarkStart w:id="1" w:name="__RefHeading___Toc1938_2251457349"/>
       <w:bookmarkEnd w:id="1"/>
       <w:r>
         <w:rPr>
@@ -891,7 +891,7 @@
         <w:pStyle w:val="Heading2"/>
         <w:rPr/>
       </w:pPr>
-      <w:bookmarkStart w:id="2" w:name="__RefHeading___Toc1940_1549724075"/>
+      <w:bookmarkStart w:id="2" w:name="__RefHeading___Toc1940_2251457349"/>
       <w:bookmarkEnd w:id="2"/>
       <w:r>
         <w:rPr>
@@ -1332,7 +1332,7 @@
         <w:pStyle w:val="Heading2"/>
         <w:rPr/>
       </w:pPr>
-      <w:bookmarkStart w:id="3" w:name="__RefHeading___Toc1942_1549724075"/>
+      <w:bookmarkStart w:id="3" w:name="__RefHeading___Toc1942_2251457349"/>
       <w:bookmarkEnd w:id="3"/>
       <w:r>
         <w:rPr>
@@ -1378,7 +1378,7 @@
         <w:pStyle w:val="Heading1"/>
         <w:rPr/>
       </w:pPr>
-      <w:bookmarkStart w:id="4" w:name="__RefHeading___Toc1944_1549724075"/>
+      <w:bookmarkStart w:id="4" w:name="__RefHeading___Toc1944_2251457349"/>
       <w:bookmarkEnd w:id="4"/>
       <w:r>
         <w:rPr>
@@ -1408,7 +1408,7 @@
         <w:pStyle w:val="Heading2"/>
         <w:rPr/>
       </w:pPr>
-      <w:bookmarkStart w:id="5" w:name="__RefHeading___Toc1946_1549724075"/>
+      <w:bookmarkStart w:id="5" w:name="__RefHeading___Toc1946_2251457349"/>
       <w:bookmarkEnd w:id="5"/>
       <w:r>
         <w:rPr>
@@ -2294,7 +2294,7 @@
         <w:pStyle w:val="Heading2"/>
         <w:rPr/>
       </w:pPr>
-      <w:bookmarkStart w:id="6" w:name="__RefHeading___Toc1948_1549724075"/>
+      <w:bookmarkStart w:id="6" w:name="__RefHeading___Toc1948_2251457349"/>
       <w:bookmarkEnd w:id="6"/>
       <w:r>
         <w:rPr>
@@ -2504,7 +2504,7 @@
         <w:pStyle w:val="Heading2"/>
         <w:rPr/>
       </w:pPr>
-      <w:bookmarkStart w:id="7" w:name="__RefHeading___Toc1950_1549724075"/>
+      <w:bookmarkStart w:id="7" w:name="__RefHeading___Toc1950_2251457349"/>
       <w:bookmarkEnd w:id="7"/>
       <w:r>
         <w:rPr>
@@ -3035,7 +3035,7 @@
         <w:pStyle w:val="Heading2"/>
         <w:rPr/>
       </w:pPr>
-      <w:bookmarkStart w:id="8" w:name="__RefHeading___Toc1952_1549724075"/>
+      <w:bookmarkStart w:id="8" w:name="__RefHeading___Toc1952_2251457349"/>
       <w:bookmarkEnd w:id="8"/>
       <w:r>
         <w:rPr>
@@ -3185,7 +3185,7 @@
         <w:pStyle w:val="Heading1"/>
         <w:rPr/>
       </w:pPr>
-      <w:bookmarkStart w:id="9" w:name="__RefHeading___Toc1954_1549724075"/>
+      <w:bookmarkStart w:id="9" w:name="__RefHeading___Toc1954_2251457349"/>
       <w:bookmarkEnd w:id="9"/>
       <w:r>
         <w:rPr>
@@ -3199,7 +3199,7 @@
         <w:pStyle w:val="Heading2"/>
         <w:rPr/>
       </w:pPr>
-      <w:bookmarkStart w:id="10" w:name="__RefHeading___Toc1956_1549724075"/>
+      <w:bookmarkStart w:id="10" w:name="__RefHeading___Toc1956_2251457349"/>
       <w:bookmarkEnd w:id="10"/>
       <w:r>
         <w:rPr>
@@ -4258,7 +4258,7 @@
         <w:pStyle w:val="Heading2"/>
         <w:rPr/>
       </w:pPr>
-      <w:bookmarkStart w:id="11" w:name="__RefHeading___Toc1958_1549724075"/>
+      <w:bookmarkStart w:id="11" w:name="__RefHeading___Toc1958_2251457349"/>
       <w:bookmarkEnd w:id="11"/>
       <w:r>
         <w:rPr>
@@ -4454,7 +4454,7 @@
         <w:pStyle w:val="Heading2"/>
         <w:rPr/>
       </w:pPr>
-      <w:bookmarkStart w:id="12" w:name="__RefHeading___Toc1960_1549724075"/>
+      <w:bookmarkStart w:id="12" w:name="__RefHeading___Toc1960_2251457349"/>
       <w:bookmarkEnd w:id="12"/>
       <w:r>
         <w:rPr>
@@ -4590,7 +4590,7 @@
         <w:pStyle w:val="Heading2"/>
         <w:rPr/>
       </w:pPr>
-      <w:bookmarkStart w:id="13" w:name="__RefHeading___Toc1962_1549724075"/>
+      <w:bookmarkStart w:id="13" w:name="__RefHeading___Toc1962_2251457349"/>
       <w:bookmarkEnd w:id="13"/>
       <w:r>
         <w:rPr>
@@ -5412,7 +5412,7 @@
         <w:pStyle w:val="Heading2"/>
         <w:rPr/>
       </w:pPr>
-      <w:bookmarkStart w:id="14" w:name="__RefHeading___Toc1964_1549724075"/>
+      <w:bookmarkStart w:id="14" w:name="__RefHeading___Toc1964_2251457349"/>
       <w:bookmarkEnd w:id="14"/>
       <w:r>
         <w:rPr>
@@ -6167,7 +6167,7 @@
         <w:spacing w:before="0" w:after="200"/>
         <w:rPr/>
       </w:pPr>
-      <w:bookmarkStart w:id="15" w:name="__RefHeading___Toc1966_1549724075"/>
+      <w:bookmarkStart w:id="15" w:name="__RefHeading___Toc1966_2251457349"/>
       <w:bookmarkEnd w:id="15"/>
       <w:r>
         <w:rPr>
@@ -12821,7 +12821,7 @@
         <w:pStyle w:val="Heading1"/>
         <w:rPr/>
       </w:pPr>
-      <w:bookmarkStart w:id="16" w:name="__RefHeading___Toc1968_1549724075"/>
+      <w:bookmarkStart w:id="16" w:name="__RefHeading___Toc1968_2251457349"/>
       <w:bookmarkEnd w:id="16"/>
       <w:r>
         <w:rPr>
@@ -12835,7 +12835,7 @@
         <w:pStyle w:val="Heading2"/>
         <w:rPr/>
       </w:pPr>
-      <w:bookmarkStart w:id="17" w:name="__RefHeading___Toc1970_1549724075"/>
+      <w:bookmarkStart w:id="17" w:name="__RefHeading___Toc1970_2251457349"/>
       <w:bookmarkEnd w:id="17"/>
       <w:r>
         <w:rPr>
@@ -13943,7 +13943,7 @@
         <w:pStyle w:val="Heading2"/>
         <w:rPr/>
       </w:pPr>
-      <w:bookmarkStart w:id="18" w:name="__RefHeading___Toc1972_1549724075"/>
+      <w:bookmarkStart w:id="18" w:name="__RefHeading___Toc1972_2251457349"/>
       <w:bookmarkEnd w:id="18"/>
       <w:r>
         <w:rPr>
@@ -13989,7 +13989,7 @@
         <w:pStyle w:val="Heading2"/>
         <w:rPr/>
       </w:pPr>
-      <w:bookmarkStart w:id="19" w:name="__RefHeading___Toc1974_1549724075"/>
+      <w:bookmarkStart w:id="19" w:name="__RefHeading___Toc1974_2251457349"/>
       <w:bookmarkEnd w:id="19"/>
       <w:r>
         <w:rPr>
@@ -14063,7 +14063,7 @@
         <w:pStyle w:val="Heading1"/>
         <w:rPr/>
       </w:pPr>
-      <w:bookmarkStart w:id="20" w:name="__RefHeading___Toc1976_1549724075"/>
+      <w:bookmarkStart w:id="20" w:name="__RefHeading___Toc1976_2251457349"/>
       <w:bookmarkEnd w:id="20"/>
       <w:r>
         <w:rPr>
@@ -14125,7 +14125,7 @@
         <w:pStyle w:val="Heading1"/>
         <w:rPr/>
       </w:pPr>
-      <w:bookmarkStart w:id="21" w:name="__RefHeading___Toc1978_1549724075"/>
+      <w:bookmarkStart w:id="21" w:name="__RefHeading___Toc1978_2251457349"/>
       <w:bookmarkEnd w:id="21"/>
       <w:r>
         <w:rPr>
@@ -14608,7 +14608,7 @@
         <w:spacing w:before="0" w:after="200"/>
         <w:rPr/>
       </w:pPr>
-      <w:bookmarkStart w:id="22" w:name="__RefHeading___Toc1980_1549724075"/>
+      <w:bookmarkStart w:id="22" w:name="__RefHeading___Toc1980_2251457349"/>
       <w:bookmarkEnd w:id="22"/>
       <w:r>
         <w:rPr>
@@ -21362,7 +21362,7 @@
         <w:rFonts w:ascii="Arial" w:hAnsi="Arial" w:eastAsia="Arial" w:cs="Arial"/>
         <w:sz w:val="22"/>
         <w:szCs w:val="22"/>
-        <w:lang w:val="en-US" w:eastAsia="zh-CN" w:bidi="hi-IN"/>
+        <w:lang w:val="es-CL" w:eastAsia="zh-CN" w:bidi="hi-IN"/>
       </w:rPr>
     </w:rPrDefault>
     <w:pPrDefault>
@@ -21386,7 +21386,7 @@
       <w:kern w:val="0"/>
       <w:sz w:val="22"/>
       <w:szCs w:val="22"/>
-      <w:lang w:val="en-US" w:eastAsia="zh-CN" w:bidi="hi-IN"/>
+      <w:lang w:val="es-CL" w:eastAsia="zh-CN" w:bidi="hi-IN"/>
     </w:rPr>
   </w:style>
   <w:style w:type="paragraph" w:styleId="Heading1">
@@ -21629,7 +21629,7 @@
       <w:kern w:val="0"/>
       <w:sz w:val="22"/>
       <w:szCs w:val="22"/>
-      <w:lang w:val="en-US" w:eastAsia="zh-CN" w:bidi="hi-IN"/>
+      <w:lang w:val="es-CL" w:eastAsia="zh-CN" w:bidi="hi-IN"/>
     </w:rPr>
   </w:style>
   <w:style w:type="paragraph" w:styleId="ListParagraph">
@@ -21647,7 +21647,7 @@
       <w:kern w:val="0"/>
       <w:sz w:val="22"/>
       <w:szCs w:val="22"/>
-      <w:lang w:val="en-US" w:eastAsia="zh-CN" w:bidi="hi-IN"/>
+      <w:lang w:val="es-CL" w:eastAsia="zh-CN" w:bidi="hi-IN"/>
     </w:rPr>
   </w:style>
   <w:style w:type="paragraph" w:styleId="FootnoteText">

</xml_diff>